<commit_message>
docs: memoria rehecha con figuras (3 páginas) y preguntas en documento aparte
- memoria: captura de la aplicación, arquitectura, flujo TCP, máquina de estados y
  gráfica real de un movej en URSim; poco texto y letra de 11 pt
- preguntas.docx: respuestas del apartado 12 con gráficas de recv() y del retraso
- figuras.py genera las figuras a partir de los datos medidos en memoria/datos/

Co-Authored-By: Claude Opus 5.5 <noreply@anthropic.com>
</commit_message>
<xml_diff>
--- a/memoria/memoria.docx
+++ b/memoria/memoria.docx
@@ -4,29 +4,371 @@
   <w:body>
     <w:p>
       <w:pPr>
+        <w:spacing w:after="0"/>
+      </w:pPr>
+      <w:r>
+        <w:rPr>
+          <w:b/>
+          <w:color w:val="005EB8"/>
+          <w:sz w:val="40"/>
+        </w:rPr>
+        <w:t>Visualizador de un UR3e por TCP/IP</w:t>
+      </w:r>
+    </w:p>
+    <w:p>
+      <w:pPr>
+        <w:spacing w:after="160"/>
+      </w:pPr>
+      <w:r>
+        <w:rPr>
+          <w:color w:val="555555"/>
+          <w:sz w:val="22"/>
+        </w:rPr>
+        <w:t>Memoria de la práctica · código en github.com/godzilin/Practica1UR</w:t>
+      </w:r>
+    </w:p>
+    <w:p>
+      <w:pPr>
+        <w:keepNext/>
+        <w:spacing w:before="200" w:after="60"/>
+      </w:pPr>
+      <w:r>
+        <w:rPr>
+          <w:b/>
+          <w:color w:val="005EB8"/>
+          <w:sz w:val="28"/>
+        </w:rPr>
+        <w:t>1. Qué hace</w:t>
+      </w:r>
+    </w:p>
+    <w:p>
+      <w:r>
+        <w:t xml:space="preserve">Lee por la red el estado de un brazo </w:t>
+      </w:r>
+      <w:r>
+        <w:rPr>
+          <w:b/>
+        </w:rPr>
+        <w:t>UR3e</w:t>
+      </w:r>
+      <w:r>
+        <w:t xml:space="preserve"> (real o simulado con URSim) y lo reproduce en 3D con </w:t>
+      </w:r>
+      <w:r>
+        <w:rPr>
+          <w:b/>
+        </w:rPr>
+        <w:t>PyBullet</w:t>
+      </w:r>
+      <w:r>
+        <w:t xml:space="preserve">. Encima, una mini-aplicación permite </w:t>
+      </w:r>
+      <w:r>
+        <w:rPr>
+          <w:b/>
+        </w:rPr>
+        <w:t>enseñar posturas</w:t>
+      </w:r>
+      <w:r>
+        <w:t xml:space="preserve"> al robot y repetirlas.</w:t>
+      </w:r>
+    </w:p>
+    <w:p>
+      <w:pPr>
+        <w:keepNext/>
+        <w:spacing w:before="80" w:after="40"/>
+        <w:jc w:val="center"/>
+      </w:pPr>
+      <w:r>
+        <w:drawing>
+          <wp:inline xmlns:a="http://schemas.openxmlformats.org/drawingml/2006/main" xmlns:pic="http://schemas.openxmlformats.org/drawingml/2006/picture">
+            <wp:extent cx="5220000" cy="2852791"/>
+            <wp:docPr id="1" name="Picture 1"/>
+            <wp:cNvGraphicFramePr>
+              <a:graphicFrameLocks noChangeAspect="1"/>
+            </wp:cNvGraphicFramePr>
+            <a:graphic>
+              <a:graphicData uri="http://schemas.openxmlformats.org/drawingml/2006/picture">
+                <pic:pic>
+                  <pic:nvPicPr>
+                    <pic:cNvPr id="0" name="captura.png"/>
+                    <pic:cNvPicPr/>
+                  </pic:nvPicPr>
+                  <pic:blipFill>
+                    <a:blip r:embed="rId11"/>
+                    <a:stretch>
+                      <a:fillRect/>
+                    </a:stretch>
+                  </pic:blipFill>
+                  <pic:spPr>
+                    <a:xfrm>
+                      <a:off x="0" y="0"/>
+                      <a:ext cx="5220000" cy="2852791"/>
+                    </a:xfrm>
+                    <a:prstGeom prst="rect"/>
+                  </pic:spPr>
+                </pic:pic>
+              </a:graphicData>
+            </a:graphic>
+          </wp:inline>
+        </w:drawing>
+      </w:r>
+    </w:p>
+    <w:p>
+      <w:pPr>
+        <w:spacing w:after="160"/>
+        <w:jc w:val="center"/>
+      </w:pPr>
+      <w:r>
+        <w:rPr>
+          <w:i/>
+          <w:color w:val="555555"/>
+          <w:sz w:val="19"/>
+        </w:rPr>
+        <w:t>Fig. 1 · Aplicación conectada a URSim. Gris: el robot. Azul: el punto que va a ejecutar («fantasma»).</w:t>
+      </w:r>
+    </w:p>
+    <w:p>
+      <w:pPr>
+        <w:keepNext/>
+        <w:spacing w:before="200" w:after="60"/>
+      </w:pPr>
+      <w:r>
+        <w:rPr>
+          <w:b/>
+          <w:color w:val="005EB8"/>
+          <w:sz w:val="28"/>
+        </w:rPr>
+        <w:t>2. Arquitectura</w:t>
+      </w:r>
+    </w:p>
+    <w:p>
+      <w:pPr>
+        <w:keepNext/>
+        <w:spacing w:before="80" w:after="40"/>
+        <w:jc w:val="center"/>
+      </w:pPr>
+      <w:r>
+        <w:drawing>
+          <wp:inline xmlns:a="http://schemas.openxmlformats.org/drawingml/2006/main" xmlns:pic="http://schemas.openxmlformats.org/drawingml/2006/picture">
+            <wp:extent cx="5400000" cy="2128560"/>
+            <wp:docPr id="2" name="Picture 2"/>
+            <wp:cNvGraphicFramePr>
+              <a:graphicFrameLocks noChangeAspect="1"/>
+            </wp:cNvGraphicFramePr>
+            <a:graphic>
+              <a:graphicData uri="http://schemas.openxmlformats.org/drawingml/2006/picture">
+                <pic:pic>
+                  <pic:nvPicPr>
+                    <pic:cNvPr id="0" name="arquitectura.png"/>
+                    <pic:cNvPicPr/>
+                  </pic:nvPicPr>
+                  <pic:blipFill>
+                    <a:blip r:embed="rId12"/>
+                    <a:stretch>
+                      <a:fillRect/>
+                    </a:stretch>
+                  </pic:blipFill>
+                  <pic:spPr>
+                    <a:xfrm>
+                      <a:off x="0" y="0"/>
+                      <a:ext cx="5400000" cy="2128560"/>
+                    </a:xfrm>
+                    <a:prstGeom prst="rect"/>
+                  </pic:spPr>
+                </pic:pic>
+              </a:graphicData>
+            </a:graphic>
+          </wp:inline>
+        </w:drawing>
+      </w:r>
+    </w:p>
+    <w:p>
+      <w:pPr>
+        <w:spacing w:after="160"/>
+        <w:jc w:val="center"/>
+      </w:pPr>
+      <w:r>
+        <w:rPr>
+          <w:i/>
+          <w:color w:val="555555"/>
+          <w:sz w:val="19"/>
+        </w:rPr>
+        <w:t>Fig. 2 · Quién hace qué: recibir, guardar el último estado y dibujar.</w:t>
+      </w:r>
+    </w:p>
+    <w:p>
+      <w:pPr>
+        <w:pStyle w:val="ListBullet"/>
         <w:spacing w:after="40"/>
       </w:pPr>
       <w:r>
         <w:rPr>
           <w:b/>
-          <w:color w:val="005EB8"/>
-          <w:sz w:val="32"/>
         </w:rPr>
-        <w:t>Práctica 1 · Visualizador de un UR3e por TCP/IP</w:t>
+        <w:t>Un hilo por robot solo recibe.</w:t>
+      </w:r>
+      <w:r>
+        <w:t xml:space="preserve"> Si un robot se cuelga, solo se bloquea su hilo.</w:t>
       </w:r>
     </w:p>
     <w:p>
       <w:pPr>
-        <w:jc w:val="both"/>
+        <w:pStyle w:val="ListBullet"/>
+        <w:spacing w:after="40"/>
       </w:pPr>
-      <w:r>
-        <w:t xml:space="preserve">El objetivo es ver en tiempo real, en una simulación 3D (PyBullet), la postura de un brazo robótico UR3e leyendo los datos que el propio robot publica por la red (TCP/IP). Se ha probado contra URSim (el robot simulado de Universal Robots en una máquina virtual en modo puente) y se han completado los cuatro niveles (A–D). Todo el código, con su historial, está en </w:t>
-      </w:r>
       <w:r>
         <w:rPr>
           <w:b/>
         </w:rPr>
-        <w:t>https://github.com/godzilin/Practica1UR</w:t>
+        <w:t>Un único bucle dibuja y envía órdenes.</w:t>
+      </w:r>
+      <w:r>
+        <w:t xml:space="preserve"> PyBullet nunca se usa desde dos hilos.</w:t>
+      </w:r>
+    </w:p>
+    <w:p>
+      <w:pPr>
+        <w:pStyle w:val="ListBullet"/>
+        <w:spacing w:after="40"/>
+      </w:pPr>
+      <w:r>
+        <w:rPr>
+          <w:b/>
+        </w:rPr>
+        <w:t>Lock</w:t>
+      </w:r>
+      <w:r>
+        <w:t xml:space="preserve"> en el estado compartido: nunca se lee un estado a medio escribir.</w:t>
+      </w:r>
+    </w:p>
+    <w:p>
+      <w:pPr>
+        <w:keepNext/>
+        <w:spacing w:before="200" w:after="60"/>
+      </w:pPr>
+      <w:r>
+        <w:rPr>
+          <w:b/>
+          <w:color w:val="005EB8"/>
+          <w:sz w:val="28"/>
+        </w:rPr>
+        <w:t>3. Leer un flujo TCP</w:t>
+      </w:r>
+    </w:p>
+    <w:p>
+      <w:pPr>
+        <w:keepNext/>
+        <w:spacing w:before="80" w:after="40"/>
+        <w:jc w:val="center"/>
+      </w:pPr>
+      <w:r>
+        <w:drawing>
+          <wp:inline xmlns:a="http://schemas.openxmlformats.org/drawingml/2006/main" xmlns:pic="http://schemas.openxmlformats.org/drawingml/2006/picture">
+            <wp:extent cx="5400000" cy="2273013"/>
+            <wp:docPr id="3" name="Picture 3"/>
+            <wp:cNvGraphicFramePr>
+              <a:graphicFrameLocks noChangeAspect="1"/>
+            </wp:cNvGraphicFramePr>
+            <a:graphic>
+              <a:graphicData uri="http://schemas.openxmlformats.org/drawingml/2006/picture">
+                <pic:pic>
+                  <pic:nvPicPr>
+                    <pic:cNvPr id="0" name="mensaje.png"/>
+                    <pic:cNvPicPr/>
+                  </pic:nvPicPr>
+                  <pic:blipFill>
+                    <a:blip r:embed="rId13"/>
+                    <a:stretch>
+                      <a:fillRect/>
+                    </a:stretch>
+                  </pic:blipFill>
+                  <pic:spPr>
+                    <a:xfrm>
+                      <a:off x="0" y="0"/>
+                      <a:ext cx="5400000" cy="2273013"/>
+                    </a:xfrm>
+                    <a:prstGeom prst="rect"/>
+                  </pic:spPr>
+                </pic:pic>
+              </a:graphicData>
+            </a:graphic>
+          </wp:inline>
+        </w:drawing>
+      </w:r>
+    </w:p>
+    <w:p>
+      <w:pPr>
+        <w:spacing w:after="160"/>
+        <w:jc w:val="center"/>
+      </w:pPr>
+      <w:r>
+        <w:rPr>
+          <w:i/>
+          <w:color w:val="555555"/>
+          <w:sz w:val="19"/>
+        </w:rPr>
+        <w:t>Fig. 3 · De los bytes que llegan por TCP a los 6 ángulos del robot.</w:t>
+      </w:r>
+    </w:p>
+    <w:p>
+      <w:pPr>
+        <w:pStyle w:val="ListBullet"/>
+        <w:spacing w:after="40"/>
+      </w:pPr>
+      <w:r>
+        <w:rPr>
+          <w:b/>
+        </w:rPr>
+        <w:t>Un recv() no es un mensaje:</w:t>
+      </w:r>
+      <w:r>
+        <w:t xml:space="preserve"> en un minuto hubo 1110 </w:t>
+      </w:r>
+      <w:r>
+        <w:rPr>
+          <w:rFonts w:ascii="Consolas" w:hAnsi="Consolas"/>
+        </w:rPr>
+        <w:t>recv()</w:t>
+      </w:r>
+      <w:r>
+        <w:t xml:space="preserve"> de 11 tamaños distintos. Se acumula en un buffer y se corta leyendo la longitud de cada mensaje.</w:t>
+      </w:r>
+    </w:p>
+    <w:p>
+      <w:pPr>
+        <w:pStyle w:val="ListBullet"/>
+        <w:spacing w:after="40"/>
+      </w:pPr>
+      <w:r>
+        <w:rPr>
+          <w:b/>
+        </w:rPr>
+        <w:t>Subpaquetes que no interesan:</w:t>
+      </w:r>
+      <w:r>
+        <w:t xml:space="preserve"> se saltan sumando su longitud, sin entenderlos.</w:t>
+      </w:r>
+    </w:p>
+    <w:p>
+      <w:pPr>
+        <w:pStyle w:val="ListBullet"/>
+        <w:spacing w:after="40"/>
+      </w:pPr>
+      <w:r>
+        <w:rPr>
+          <w:b/>
+        </w:rPr>
+        <w:t>Big-endian:</w:t>
+      </w:r>
+      <w:r>
+        <w:t xml:space="preserve"> el robot ordena los bytes al revés que el PC; se indica con </w:t>
+      </w:r>
+      <w:r>
+        <w:rPr>
+          <w:rFonts w:ascii="Consolas" w:hAnsi="Consolas"/>
+        </w:rPr>
+        <w:t>&gt;</w:t>
       </w:r>
       <w:r>
         <w:t>.</w:t>
@@ -35,112 +377,15 @@
     <w:p>
       <w:pPr>
         <w:keepNext/>
-        <w:spacing w:before="140" w:after="40"/>
+        <w:spacing w:before="200" w:after="60"/>
       </w:pPr>
       <w:r>
         <w:rPr>
           <w:b/>
           <w:color w:val="005EB8"/>
-          <w:sz w:val="25"/>
+          <w:sz w:val="28"/>
         </w:rPr>
-        <w:t>1. Cómo funciona: la idea común</w:t>
-      </w:r>
-    </w:p>
-    <w:p>
-      <w:pPr>
-        <w:jc w:val="both"/>
-      </w:pPr>
-      <w:r>
-        <w:t xml:space="preserve">El robot no envía «mensajes» sueltos: TCP entrega un </w:t>
-      </w:r>
-      <w:r>
-        <w:rPr>
-          <w:b/>
-        </w:rPr>
-        <w:t>flujo continuo de bytes</w:t>
-      </w:r>
-      <w:r>
-        <w:t xml:space="preserve">, y cada </w:t>
-      </w:r>
-      <w:r>
-        <w:rPr>
-          <w:rFonts w:ascii="Consolas" w:hAnsi="Consolas"/>
-          <w:sz w:val="18"/>
-        </w:rPr>
-        <w:t>recv()</w:t>
-      </w:r>
-      <w:r>
-        <w:t xml:space="preserve"> puede traer medio mensaje, uno o varios. Por eso todos los programas siguen la misma estrategia de lectura: (1) se acumula lo recibido en un </w:t>
-      </w:r>
-      <w:r>
-        <w:rPr>
-          <w:b/>
-        </w:rPr>
-        <w:t>buffer</w:t>
-      </w:r>
-      <w:r>
-        <w:t xml:space="preserve">; (2) se lee la </w:t>
-      </w:r>
-      <w:r>
-        <w:rPr>
-          <w:b/>
-        </w:rPr>
-        <w:t>longitud</w:t>
-      </w:r>
-      <w:r>
-        <w:t xml:space="preserve"> que va al principio de cada mensaje (4 bytes) y solo se procesa cuando ha llegado entero; (3) dentro de él se recorren los </w:t>
-      </w:r>
-      <w:r>
-        <w:rPr>
-          <w:b/>
-        </w:rPr>
-        <w:t>subpaquetes</w:t>
-      </w:r>
-      <w:r>
-        <w:t xml:space="preserve"> saltando de uno a otro con su propia longitud, sin necesidad de entender los que no interesan; (4) los números se decodifican en </w:t>
-      </w:r>
-      <w:r>
-        <w:rPr>
-          <w:b/>
-        </w:rPr>
-        <w:t>big-endian</w:t>
-      </w:r>
-      <w:r>
-        <w:t xml:space="preserve"> con </w:t>
-      </w:r>
-      <w:r>
-        <w:rPr>
-          <w:rFonts w:ascii="Consolas" w:hAnsi="Consolas"/>
-          <w:sz w:val="18"/>
-        </w:rPr>
-        <w:t>struct</w:t>
-      </w:r>
-      <w:r>
-        <w:t xml:space="preserve">. Si una longitud es absurda, el buffer se ha desalineado y se reconecta. Cada script tiene sus parámetros como constantes al principio y las IP de los robots en </w:t>
-      </w:r>
-      <w:r>
-        <w:rPr>
-          <w:rFonts w:ascii="Consolas" w:hAnsi="Consolas"/>
-          <w:sz w:val="18"/>
-        </w:rPr>
-        <w:t>robots.json</w:t>
-      </w:r>
-      <w:r>
-        <w:t>, de modo que se configura sin tocar el código y se ejecuta con F5 en VS Code.</w:t>
-      </w:r>
-    </w:p>
-    <w:p>
-      <w:pPr>
-        <w:keepNext/>
-        <w:spacing w:before="140" w:after="40"/>
-      </w:pPr>
-      <w:r>
-        <w:rPr>
-          <w:b/>
-          <w:color w:val="005EB8"/>
-          <w:sz w:val="25"/>
-        </w:rPr>
-        <w:t>2. El código, por tareas</w:t>
+        <w:t>4. Las cuatro tareas</w:t>
       </w:r>
     </w:p>
     <w:tbl>
@@ -151,25 +396,25 @@
         <w:tblLook w:firstColumn="1" w:firstRow="1" w:lastColumn="0" w:lastRow="0" w:noHBand="0" w:noVBand="1" w:val="04A0"/>
       </w:tblPr>
       <w:tblGrid>
-        <w:gridCol w:w="3251"/>
-        <w:gridCol w:w="3251"/>
-        <w:gridCol w:w="3251"/>
+        <w:gridCol w:w="3213"/>
+        <w:gridCol w:w="3213"/>
+        <w:gridCol w:w="3213"/>
       </w:tblGrid>
       <w:tr>
         <w:tc>
           <w:tcPr>
-            <w:tcW w:type="dxa" w:w="1701"/>
+            <w:tcW w:type="dxa" w:w="2268"/>
             <w:shd w:val="clear" w:fill="005EB8"/>
           </w:tcPr>
           <w:p>
             <w:pPr>
-              <w:spacing w:after="0"/>
+              <w:spacing w:after="20" w:before="20"/>
             </w:pPr>
             <w:r>
               <w:rPr>
                 <w:b/>
                 <w:color w:val="FFFFFF"/>
-                <w:sz w:val="18"/>
+                <w:sz w:val="20"/>
               </w:rPr>
               <w:t>Tarea</w:t>
             </w:r>
@@ -177,18 +422,18 @@
         </w:tc>
         <w:tc>
           <w:tcPr>
-            <w:tcW w:type="dxa" w:w="1871"/>
+            <w:tcW w:type="dxa" w:w="2494"/>
             <w:shd w:val="clear" w:fill="005EB8"/>
           </w:tcPr>
           <w:p>
             <w:pPr>
-              <w:spacing w:after="0"/>
+              <w:spacing w:after="20" w:before="20"/>
             </w:pPr>
             <w:r>
               <w:rPr>
                 <w:b/>
                 <w:color w:val="FFFFFF"/>
-                <w:sz w:val="18"/>
+                <w:sz w:val="20"/>
               </w:rPr>
               <w:t>Script</w:t>
             </w:r>
@@ -196,20 +441,20 @@
         </w:tc>
         <w:tc>
           <w:tcPr>
-            <w:tcW w:type="dxa" w:w="6180"/>
+            <w:tcW w:type="dxa" w:w="4876"/>
             <w:shd w:val="clear" w:fill="005EB8"/>
           </w:tcPr>
           <w:p>
             <w:pPr>
-              <w:spacing w:after="0"/>
+              <w:spacing w:after="20" w:before="20"/>
             </w:pPr>
             <w:r>
               <w:rPr>
                 <w:b/>
                 <w:color w:val="FFFFFF"/>
-                <w:sz w:val="18"/>
+                <w:sz w:val="20"/>
               </w:rPr>
-              <w:t>Qué hace y cómo</w:t>
+              <w:t>Idea clave</w:t>
             </w:r>
           </w:p>
         </w:tc>
@@ -217,39 +462,32 @@
       <w:tr>
         <w:tc>
           <w:tcPr>
-            <w:tcW w:type="dxa" w:w="1701"/>
+            <w:tcW w:type="dxa" w:w="2268"/>
           </w:tcPr>
           <w:p>
             <w:pPr>
-              <w:spacing w:after="0"/>
+              <w:spacing w:after="20" w:before="20"/>
             </w:pPr>
             <w:r>
               <w:rPr>
-                <w:b/>
-                <w:sz w:val="18"/>
+                <w:sz w:val="20"/>
               </w:rPr>
-              <w:t>A</w:t>
-            </w:r>
-            <w:r>
-              <w:rPr>
-                <w:sz w:val="18"/>
-              </w:rPr>
-              <w:t xml:space="preserve"> · Interfaz primaria</w:t>
+              <w:t>A · Primaria</w:t>
             </w:r>
           </w:p>
         </w:tc>
         <w:tc>
           <w:tcPr>
-            <w:tcW w:type="dxa" w:w="1871"/>
+            <w:tcW w:type="dxa" w:w="2494"/>
           </w:tcPr>
           <w:p>
             <w:pPr>
-              <w:spacing w:after="0"/>
+              <w:spacing w:after="20" w:before="20"/>
             </w:pPr>
             <w:r>
               <w:rPr>
                 <w:rFonts w:ascii="Consolas" w:hAnsi="Consolas"/>
-                <w:sz w:val="18"/>
+                <w:sz w:val="20"/>
               </w:rPr>
               <w:t>primaria.py</w:t>
             </w:r>
@@ -257,30 +495,17 @@
         </w:tc>
         <w:tc>
           <w:tcPr>
-            <w:tcW w:type="dxa" w:w="6180"/>
+            <w:tcW w:type="dxa" w:w="4876"/>
           </w:tcPr>
           <w:p>
             <w:pPr>
-              <w:spacing w:after="0"/>
+              <w:spacing w:after="20" w:before="20"/>
             </w:pPr>
             <w:r>
               <w:rPr>
-                <w:sz w:val="18"/>
+                <w:sz w:val="20"/>
               </w:rPr>
-              <w:t xml:space="preserve">Puerto 30001, 10 mensajes por segundo. Corta el flujo en mensajes, busca el de estado (tipo 16) y en él el subpaquete de articulaciones (tipo 1), del que saca los 6 ángulos </w:t>
-            </w:r>
-            <w:r>
-              <w:rPr>
-                <w:rFonts w:ascii="Consolas" w:hAnsi="Consolas"/>
-                <w:sz w:val="18"/>
-              </w:rPr>
-              <w:t>q_actual</w:t>
-            </w:r>
-            <w:r>
-              <w:rPr>
-                <w:sz w:val="18"/>
-              </w:rPr>
-              <w:t xml:space="preserve"> para mover el robot 3D. Muestra también los mensajes del robot (versión, errores) y reconecta solo si se cae.</w:t>
+              <w:t>Puerto 30001 · 10 estados/s · ángulos del subpaquete 1</w:t>
             </w:r>
           </w:p>
         </w:tc>
@@ -288,39 +513,32 @@
       <w:tr>
         <w:tc>
           <w:tcPr>
-            <w:tcW w:type="dxa" w:w="1701"/>
+            <w:tcW w:type="dxa" w:w="2268"/>
           </w:tcPr>
           <w:p>
             <w:pPr>
-              <w:spacing w:after="0"/>
+              <w:spacing w:after="20" w:before="20"/>
             </w:pPr>
             <w:r>
               <w:rPr>
-                <w:b/>
-                <w:sz w:val="18"/>
+                <w:sz w:val="20"/>
               </w:rPr>
-              <w:t>B</w:t>
-            </w:r>
-            <w:r>
-              <w:rPr>
-                <w:sz w:val="18"/>
-              </w:rPr>
-              <w:t xml:space="preserve"> · Tiempo real</w:t>
+              <w:t>B · Tiempo real</w:t>
             </w:r>
           </w:p>
         </w:tc>
         <w:tc>
           <w:tcPr>
-            <w:tcW w:type="dxa" w:w="1871"/>
+            <w:tcW w:type="dxa" w:w="2494"/>
           </w:tcPr>
           <w:p>
             <w:pPr>
-              <w:spacing w:after="0"/>
+              <w:spacing w:after="20" w:before="20"/>
             </w:pPr>
             <w:r>
               <w:rPr>
                 <w:rFonts w:ascii="Consolas" w:hAnsi="Consolas"/>
-                <w:sz w:val="18"/>
+                <w:sz w:val="20"/>
               </w:rPr>
               <w:t>tiempo_real.py</w:t>
             </w:r>
@@ -328,30 +546,17 @@
         </w:tc>
         <w:tc>
           <w:tcPr>
-            <w:tcW w:type="dxa" w:w="6180"/>
+            <w:tcW w:type="dxa" w:w="4876"/>
           </w:tcPr>
           <w:p>
             <w:pPr>
-              <w:spacing w:after="0"/>
+              <w:spacing w:after="20" w:before="20"/>
             </w:pPr>
             <w:r>
               <w:rPr>
-                <w:sz w:val="18"/>
+                <w:sz w:val="20"/>
               </w:rPr>
-              <w:t xml:space="preserve">Puerto 30003, unos 500 paquetes por segundo de estructura fija: los ángulos están siempre en el byte 252. Lee todos los paquetes pero solo guarda el último y dibuja 30 veces por segundo; dibujar cada paquete saturaría el programa. Mide paquetes/s y paquetes por </w:t>
-            </w:r>
-            <w:r>
-              <w:rPr>
-                <w:rFonts w:ascii="Consolas" w:hAnsi="Consolas"/>
-                <w:sz w:val="18"/>
-              </w:rPr>
-              <w:t>recv()</w:t>
-            </w:r>
-            <w:r>
-              <w:rPr>
-                <w:sz w:val="18"/>
-              </w:rPr>
-              <w:t>.</w:t>
+              <w:t>Puerto 30003 · ~500 paquetes/s · se queda el último y dibuja 30/s</w:t>
             </w:r>
           </w:p>
         </w:tc>
@@ -359,39 +564,32 @@
       <w:tr>
         <w:tc>
           <w:tcPr>
-            <w:tcW w:type="dxa" w:w="1701"/>
+            <w:tcW w:type="dxa" w:w="2268"/>
           </w:tcPr>
           <w:p>
             <w:pPr>
-              <w:spacing w:after="0"/>
+              <w:spacing w:after="20" w:before="20"/>
             </w:pPr>
             <w:r>
               <w:rPr>
-                <w:b/>
-                <w:sz w:val="18"/>
+                <w:sz w:val="20"/>
               </w:rPr>
-              <w:t>C</w:t>
-            </w:r>
-            <w:r>
-              <w:rPr>
-                <w:sz w:val="18"/>
-              </w:rPr>
-              <w:t xml:space="preserve"> · Varios robots</w:t>
+              <w:t>C · Varios robots</w:t>
             </w:r>
           </w:p>
         </w:tc>
         <w:tc>
           <w:tcPr>
-            <w:tcW w:type="dxa" w:w="1871"/>
+            <w:tcW w:type="dxa" w:w="2494"/>
           </w:tcPr>
           <w:p>
             <w:pPr>
-              <w:spacing w:after="0"/>
+              <w:spacing w:after="20" w:before="20"/>
             </w:pPr>
             <w:r>
               <w:rPr>
                 <w:rFonts w:ascii="Consolas" w:hAnsi="Consolas"/>
-                <w:sz w:val="18"/>
+                <w:sz w:val="20"/>
               </w:rPr>
               <w:t>varios_robots.py</w:t>
             </w:r>
@@ -399,43 +597,17 @@
         </w:tc>
         <w:tc>
           <w:tcPr>
-            <w:tcW w:type="dxa" w:w="6180"/>
+            <w:tcW w:type="dxa" w:w="4876"/>
           </w:tcPr>
           <w:p>
             <w:pPr>
-              <w:spacing w:after="0"/>
+              <w:spacing w:after="20" w:before="20"/>
             </w:pPr>
             <w:r>
               <w:rPr>
-                <w:sz w:val="18"/>
+                <w:sz w:val="20"/>
               </w:rPr>
-              <w:t xml:space="preserve">Un </w:t>
-            </w:r>
-            <w:r>
-              <w:rPr>
-                <w:b/>
-                <w:sz w:val="18"/>
-              </w:rPr>
-              <w:t>hilo</w:t>
-            </w:r>
-            <w:r>
-              <w:rPr>
-                <w:sz w:val="18"/>
-              </w:rPr>
-              <w:t xml:space="preserve"> por robot recibe sus datos y deja el último estado en una variable compartida protegida con un </w:t>
-            </w:r>
-            <w:r>
-              <w:rPr>
-                <w:b/>
-                <w:sz w:val="18"/>
-              </w:rPr>
-              <w:t>Lock</w:t>
-            </w:r>
-            <w:r>
-              <w:rPr>
-                <w:sz w:val="18"/>
-              </w:rPr>
-              <w:t>; un único bucle dibuja todos los robots. Si uno deja de enviar, solo ese se congela y su etiqueta pasa a rojo «SIN DATOS»; los demás siguen.</w:t>
+              <w:t>Un hilo por robot · «SIN DATOS» en rojo si uno se cae</w:t>
             </w:r>
           </w:p>
         </w:tc>
@@ -443,39 +615,32 @@
       <w:tr>
         <w:tc>
           <w:tcPr>
-            <w:tcW w:type="dxa" w:w="1701"/>
+            <w:tcW w:type="dxa" w:w="2268"/>
           </w:tcPr>
           <w:p>
             <w:pPr>
-              <w:spacing w:after="0"/>
+              <w:spacing w:after="20" w:before="20"/>
             </w:pPr>
             <w:r>
               <w:rPr>
-                <w:b/>
-                <w:sz w:val="18"/>
+                <w:sz w:val="20"/>
               </w:rPr>
-              <w:t>D</w:t>
-            </w:r>
-            <w:r>
-              <w:rPr>
-                <w:sz w:val="18"/>
-              </w:rPr>
-              <w:t xml:space="preserve"> · Enseñar y reproducir</w:t>
+              <w:t>D · Enseñar y reproducir</w:t>
             </w:r>
           </w:p>
         </w:tc>
         <w:tc>
           <w:tcPr>
-            <w:tcW w:type="dxa" w:w="1871"/>
+            <w:tcW w:type="dxa" w:w="2494"/>
           </w:tcPr>
           <w:p>
             <w:pPr>
-              <w:spacing w:after="0"/>
+              <w:spacing w:after="20" w:before="20"/>
             </w:pPr>
             <w:r>
               <w:rPr>
                 <w:rFonts w:ascii="Consolas" w:hAnsi="Consolas"/>
-                <w:sz w:val="18"/>
+                <w:sz w:val="20"/>
               </w:rPr>
               <w:t>ensenar_reproducir.py</w:t>
             </w:r>
@@ -483,107 +648,17 @@
         </w:tc>
         <w:tc>
           <w:tcPr>
-            <w:tcW w:type="dxa" w:w="6180"/>
+            <w:tcW w:type="dxa" w:w="4876"/>
           </w:tcPr>
           <w:p>
             <w:pPr>
-              <w:spacing w:after="0"/>
+              <w:spacing w:after="20" w:before="20"/>
             </w:pPr>
             <w:r>
               <w:rPr>
-                <w:sz w:val="18"/>
+                <w:sz w:val="20"/>
               </w:rPr>
-              <w:t xml:space="preserve">Mini-aplicación manejada con el teclado: se guardan posturas del robot como puntos, se </w:t>
-            </w:r>
-            <w:r>
-              <w:rPr>
-                <w:b/>
-                <w:sz w:val="18"/>
-              </w:rPr>
-              <w:t>previsualizan</w:t>
-            </w:r>
-            <w:r>
-              <w:rPr>
-                <w:sz w:val="18"/>
-              </w:rPr>
-              <w:t xml:space="preserve"> con un robot «fantasma» semitransparente sin mover el real y se ejecutan con </w:t>
-            </w:r>
-            <w:r>
-              <w:rPr>
-                <w:rFonts w:ascii="Consolas" w:hAnsi="Consolas"/>
-                <w:sz w:val="18"/>
-              </w:rPr>
-              <w:t>movej</w:t>
-            </w:r>
-            <w:r>
-              <w:rPr>
-                <w:sz w:val="18"/>
-              </w:rPr>
-              <w:t xml:space="preserve"> punto a punto. Una </w:t>
-            </w:r>
-            <w:r>
-              <w:rPr>
-                <w:b/>
-                <w:sz w:val="18"/>
-              </w:rPr>
-              <w:t>máquina de estados</w:t>
-            </w:r>
-            <w:r>
-              <w:rPr>
-                <w:sz w:val="18"/>
-              </w:rPr>
-              <w:t xml:space="preserve"> confirma cada punto con el estado del robot y, si hay error o parada de protección, detiene la secuencia, muestra el motivo y permite reanudar.</w:t>
-            </w:r>
-          </w:p>
-        </w:tc>
-      </w:tr>
-      <w:tr>
-        <w:tc>
-          <w:tcPr>
-            <w:tcW w:type="dxa" w:w="1701"/>
-          </w:tcPr>
-          <w:p>
-            <w:pPr>
-              <w:spacing w:after="0"/>
-            </w:pPr>
-            <w:r>
-              <w:rPr>
-                <w:sz w:val="18"/>
-              </w:rPr>
-              <w:t>Herramienta</w:t>
-            </w:r>
-          </w:p>
-        </w:tc>
-        <w:tc>
-          <w:tcPr>
-            <w:tcW w:type="dxa" w:w="1871"/>
-          </w:tcPr>
-          <w:p>
-            <w:pPr>
-              <w:spacing w:after="0"/>
-            </w:pPr>
-            <w:r>
-              <w:rPr>
-                <w:rFonts w:ascii="Consolas" w:hAnsi="Consolas"/>
-                <w:sz w:val="18"/>
-              </w:rPr>
-              <w:t>test_conexion.py</w:t>
-            </w:r>
-          </w:p>
-        </w:tc>
-        <w:tc>
-          <w:tcPr>
-            <w:tcW w:type="dxa" w:w="6180"/>
-          </w:tcPr>
-          <w:p>
-            <w:pPr>
-              <w:spacing w:after="0"/>
-            </w:pPr>
-            <w:r>
-              <w:rPr>
-                <w:sz w:val="18"/>
-              </w:rPr>
-              <w:t>Comprueba la conexión, el modo del robot y, opcionalmente, gira la base unos grados y vuelve.</w:t>
+              <w:t>Enseñar · previsualizar · ejecutar y confirmar</w:t>
             </w:r>
           </w:p>
         </w:tc>
@@ -591,551 +666,275 @@
     </w:tbl>
     <w:p>
       <w:pPr>
+        <w:spacing w:after="0"/>
+      </w:pPr>
+    </w:p>
+    <w:p>
+      <w:pPr>
         <w:keepNext/>
-        <w:spacing w:before="140" w:after="40"/>
+        <w:spacing w:before="200" w:after="60"/>
       </w:pPr>
       <w:r>
         <w:rPr>
           <w:b/>
           <w:color w:val="005EB8"/>
-          <w:sz w:val="25"/>
+          <w:sz w:val="28"/>
         </w:rPr>
-        <w:t>3. Trabajo adicional</w:t>
+        <w:t>5. Enseñar y reproducir</w:t>
+      </w:r>
+    </w:p>
+    <w:p>
+      <w:r>
+        <w:t xml:space="preserve">Una </w:t>
+      </w:r>
+      <w:r>
+        <w:rPr>
+          <w:b/>
+        </w:rPr>
+        <w:t>máquina de estados</w:t>
+      </w:r>
+      <w:r>
+        <w:t xml:space="preserve"> lleva la secuencia. El robot no responde a un </w:t>
+      </w:r>
+      <w:r>
+        <w:rPr>
+          <w:rFonts w:ascii="Consolas" w:hAnsi="Consolas"/>
+        </w:rPr>
+        <w:t>movej</w:t>
+      </w:r>
+      <w:r>
+        <w:t>: hay que deducir del estado que publica si lo ha cumplido.</w:t>
+      </w:r>
+    </w:p>
+    <w:p>
+      <w:pPr>
+        <w:keepNext/>
+        <w:spacing w:before="80" w:after="40"/>
+        <w:jc w:val="center"/>
+      </w:pPr>
+      <w:r>
+        <w:drawing>
+          <wp:inline xmlns:a="http://schemas.openxmlformats.org/drawingml/2006/main" xmlns:pic="http://schemas.openxmlformats.org/drawingml/2006/picture">
+            <wp:extent cx="4320000" cy="2012727"/>
+            <wp:docPr id="4" name="Picture 4"/>
+            <wp:cNvGraphicFramePr>
+              <a:graphicFrameLocks noChangeAspect="1"/>
+            </wp:cNvGraphicFramePr>
+            <a:graphic>
+              <a:graphicData uri="http://schemas.openxmlformats.org/drawingml/2006/picture">
+                <pic:pic>
+                  <pic:nvPicPr>
+                    <pic:cNvPr id="0" name="estados.png"/>
+                    <pic:cNvPicPr/>
+                  </pic:nvPicPr>
+                  <pic:blipFill>
+                    <a:blip r:embed="rId14"/>
+                    <a:stretch>
+                      <a:fillRect/>
+                    </a:stretch>
+                  </pic:blipFill>
+                  <pic:spPr>
+                    <a:xfrm>
+                      <a:off x="0" y="0"/>
+                      <a:ext cx="4320000" cy="2012727"/>
+                    </a:xfrm>
+                    <a:prstGeom prst="rect"/>
+                  </pic:spPr>
+                </pic:pic>
+              </a:graphicData>
+            </a:graphic>
+          </wp:inline>
+        </w:drawing>
+      </w:r>
+    </w:p>
+    <w:p>
+      <w:pPr>
+        <w:spacing w:after="160"/>
+        <w:jc w:val="center"/>
+      </w:pPr>
+      <w:r>
+        <w:rPr>
+          <w:i/>
+          <w:color w:val="555555"/>
+          <w:sz w:val="19"/>
+        </w:rPr>
+        <w:t>Fig. 4 · Máquina de estados de la secuencia.</w:t>
+      </w:r>
+    </w:p>
+    <w:p>
+      <w:pPr>
+        <w:keepNext/>
+        <w:spacing w:before="80" w:after="40"/>
+        <w:jc w:val="center"/>
+      </w:pPr>
+      <w:r>
+        <w:drawing>
+          <wp:inline xmlns:a="http://schemas.openxmlformats.org/drawingml/2006/main" xmlns:pic="http://schemas.openxmlformats.org/drawingml/2006/picture">
+            <wp:extent cx="5400000" cy="2184100"/>
+            <wp:docPr id="5" name="Picture 5"/>
+            <wp:cNvGraphicFramePr>
+              <a:graphicFrameLocks noChangeAspect="1"/>
+            </wp:cNvGraphicFramePr>
+            <a:graphic>
+              <a:graphicData uri="http://schemas.openxmlformats.org/drawingml/2006/picture">
+                <pic:pic>
+                  <pic:nvPicPr>
+                    <pic:cNvPr id="0" name="movej.png"/>
+                    <pic:cNvPicPr/>
+                  </pic:nvPicPr>
+                  <pic:blipFill>
+                    <a:blip r:embed="rId15"/>
+                    <a:stretch>
+                      <a:fillRect/>
+                    </a:stretch>
+                  </pic:blipFill>
+                  <pic:spPr>
+                    <a:xfrm>
+                      <a:off x="0" y="0"/>
+                      <a:ext cx="5400000" cy="2184100"/>
+                    </a:xfrm>
+                    <a:prstGeom prst="rect"/>
+                  </pic:spPr>
+                </pic:pic>
+              </a:graphicData>
+            </a:graphic>
+          </wp:inline>
+        </w:drawing>
+      </w:r>
+    </w:p>
+    <w:p>
+      <w:pPr>
+        <w:spacing w:after="160"/>
+        <w:jc w:val="center"/>
+      </w:pPr>
+      <w:r>
+        <w:rPr>
+          <w:i/>
+          <w:color w:val="555555"/>
+          <w:sz w:val="19"/>
+        </w:rPr>
+        <w:t>Fig. 5 · Datos reales de URSim. Un punto se da por bueno cuando el programa termina y el ángulo está a menos de 0,01 rad del objetivo.</w:t>
+      </w:r>
+    </w:p>
+    <w:p>
+      <w:pPr>
+        <w:keepNext/>
+        <w:spacing w:before="200" w:after="60"/>
+      </w:pPr>
+      <w:r>
+        <w:rPr>
+          <w:b/>
+          <w:color w:val="005EB8"/>
+          <w:sz w:val="28"/>
+        </w:rPr>
+        <w:t>6. Además</w:t>
       </w:r>
     </w:p>
     <w:p>
       <w:pPr>
         <w:pStyle w:val="ListBullet"/>
-        <w:spacing w:after="20"/>
-        <w:jc w:val="both"/>
+        <w:spacing w:after="40"/>
       </w:pPr>
       <w:r>
         <w:rPr>
           <w:b/>
         </w:rPr>
-        <w:t>Repositorio GitHub con control de versiones</w:t>
+        <w:t>Repositorio GitHub</w:t>
       </w:r>
       <w:r>
-        <w:t>: cada cambio se ha subido como un commit, con README (instalación, uso, configuración de IP) y un documento de diseño de la aplicación D con el guion de la defensa.</w:t>
+        <w:t xml:space="preserve"> (github.com/godzilin/Practica1UR): cada cambio es un commit; README con instalación y uso.</w:t>
       </w:r>
     </w:p>
     <w:p>
       <w:pPr>
         <w:pStyle w:val="ListBullet"/>
-        <w:spacing w:after="20"/>
-        <w:jc w:val="both"/>
+        <w:spacing w:after="40"/>
       </w:pPr>
       <w:r>
         <w:rPr>
           <w:b/>
         </w:rPr>
-        <w:t>Robustez («a prueba de bombas»)</w:t>
+        <w:t>A prueba de fallos:</w:t>
       </w:r>
       <w:r>
-        <w:t xml:space="preserve">: </w:t>
-      </w:r>
-      <w:r>
-        <w:rPr>
-          <w:rFonts w:ascii="Consolas" w:hAnsi="Consolas"/>
-          <w:sz w:val="18"/>
-        </w:rPr>
-        <w:t>robots.json</w:t>
-      </w:r>
-      <w:r>
-        <w:t xml:space="preserve"> se valida con mensajes claros; los mensajes truncados, corruptos o con ángulos no numéricos se descartan sin romper nada; los hilos nunca mueren en silencio; si se pierde la red o el robot se reinicia, se reconecta solo; cerrar la ventana termina el programa limpiamente.</w:t>
+        <w:t xml:space="preserve"> reconexión automática, mensajes corruptos descartados, configuración validada. Probado con 20 000 mensajes rotos, cortes de red y URSim reiniciado.</w:t>
       </w:r>
     </w:p>
     <w:p>
       <w:pPr>
         <w:pStyle w:val="ListBullet"/>
-        <w:spacing w:after="20"/>
-        <w:jc w:val="both"/>
+        <w:spacing w:after="40"/>
       </w:pPr>
       <w:r>
         <w:rPr>
           <w:b/>
         </w:rPr>
-        <w:t>Seguridad del robot</w:t>
+        <w:t>Seguridad:</w:t>
       </w:r>
       <w:r>
-        <w:t xml:space="preserve">: si el programa se cierra (Ctrl+C, ventana, fallo) con el robot moviéndose, se envía </w:t>
+        <w:t xml:space="preserve"> </w:t>
       </w:r>
       <w:r>
         <w:rPr>
           <w:rFonts w:ascii="Consolas" w:hAnsi="Consolas"/>
-          <w:sz w:val="18"/>
         </w:rPr>
         <w:t>stopj</w:t>
       </w:r>
       <w:r>
-        <w:t xml:space="preserve"> antes de salir; velocidad y aceleración se limitan a 0,3 rad/s y 0,5 rad/s²; cada punto se comprueba antes de enviarlo; una parada de emergencia nunca se desbloquea por red.</w:t>
+        <w:t xml:space="preserve"> si el programa se cierra con el robot en marcha; velocidad ≤ 0,3 rad/s; una parada de emergencia nunca se desbloquea por red.</w:t>
       </w:r>
     </w:p>
     <w:p>
       <w:pPr>
         <w:pStyle w:val="ListBullet"/>
-        <w:spacing w:after="20"/>
-        <w:jc w:val="both"/>
+        <w:spacing w:after="40"/>
       </w:pPr>
       <w:r>
         <w:rPr>
           <w:b/>
         </w:rPr>
-        <w:t>Pruebas</w:t>
+        <w:t>Fácil de usar:</w:t>
       </w:r>
       <w:r>
-        <w:t xml:space="preserve">: </w:t>
+        <w:t xml:space="preserve"> F5 en VS Code, ajustes como constantes al principio, IP en </w:t>
       </w:r>
       <w:r>
         <w:rPr>
           <w:rFonts w:ascii="Consolas" w:hAnsi="Consolas"/>
-          <w:sz w:val="18"/>
         </w:rPr>
-        <w:t>prueba_robustez.py</w:t>
+        <w:t>robots.json</w:t>
       </w:r>
       <w:r>
-        <w:t xml:space="preserve"> lanza 20 000 mensajes rotos contra el lector; un robot falso envió basura, silencios y mensajes cortados; y en URSim se apagó el robot, se cortó la red y se cayó el dashboard a mitad de una secuencia. En todos los casos la aplicación se recuperó.</w:t>
+        <w:t>.</w:t>
       </w:r>
     </w:p>
     <w:p>
       <w:pPr>
         <w:keepNext/>
-        <w:spacing w:before="140" w:after="40"/>
+        <w:spacing w:before="200" w:after="60"/>
       </w:pPr>
       <w:r>
         <w:rPr>
           <w:b/>
           <w:color w:val="005EB8"/>
-          <w:sz w:val="25"/>
+          <w:sz w:val="28"/>
         </w:rPr>
-        <w:t>4. Robot real</w:t>
+        <w:t>7. Robot real</w:t>
       </w:r>
     </w:p>
     <w:p>
-      <w:pPr>
-        <w:jc w:val="both"/>
-      </w:pPr>
       <w:r>
         <w:rPr>
           <w:b/>
         </w:rPr>
-        <w:t>[Completar tras la sesión en el laboratorio: qué UR3e se ha usado (10.172.21.x) y qué diferencias se han observado respecto a URSim.]</w:t>
-      </w:r>
-      <w:r>
-        <w:t xml:space="preserve"> En URSim se observó, por ejemplo, que la interfaz de tiempo real da unos 480 paquetes/s en lugar de 500 porque la máquina virtual simula algo más lenta que el tiempo real.</w:t>
-      </w:r>
-    </w:p>
-    <w:p>
-      <w:pPr>
-        <w:keepNext/>
-        <w:spacing w:before="140" w:after="40"/>
-      </w:pPr>
-      <w:r>
-        <w:rPr>
-          <w:b/>
-          <w:color w:val="005EB8"/>
-          <w:sz w:val="25"/>
-        </w:rPr>
-        <w:t>5. Preguntas de comprensión</w:t>
-      </w:r>
-    </w:p>
-    <w:p>
-      <w:pPr>
-        <w:keepNext/>
-        <w:spacing w:before="60" w:after="20"/>
-      </w:pPr>
-      <w:r>
-        <w:rPr>
-          <w:b/>
-          <w:color w:val="005EB8"/>
-        </w:rPr>
-        <w:t>1. ¿Coincide cada recv() con un mensaje?</w:t>
-      </w:r>
-    </w:p>
-    <w:p>
-      <w:pPr>
-        <w:jc w:val="both"/>
-      </w:pPr>
-      <w:r>
-        <w:t xml:space="preserve">No. En un minuto contra URSim hubo 1113 </w:t>
-      </w:r>
-      <w:r>
-        <w:rPr>
-          <w:rFonts w:ascii="Consolas" w:hAnsi="Consolas"/>
-          <w:sz w:val="18"/>
-        </w:rPr>
-        <w:t>recv()</w:t>
-      </w:r>
-      <w:r>
-        <w:t xml:space="preserve"> de 11 tamaños distintos (de 9 a 1448 bytes): 1025 trajeron justo un mensaje, 86 trajeron varios y alguno dejó un mensaje a medias. Además el mensaje de estado no mide siempre lo mismo (722 o 743 bytes). Consecuencia: nunca se puede suponer que un </w:t>
-      </w:r>
-      <w:r>
-        <w:rPr>
-          <w:rFonts w:ascii="Consolas" w:hAnsi="Consolas"/>
-          <w:sz w:val="18"/>
-        </w:rPr>
-        <w:t>recv()</w:t>
-      </w:r>
-      <w:r>
-        <w:t xml:space="preserve"> es un mensaje; hay que acumular en un buffer y cortar por la longitud.</w:t>
-      </w:r>
-    </w:p>
-    <w:p>
-      <w:pPr>
-        <w:keepNext/>
-        <w:spacing w:before="60" w:after="20"/>
-      </w:pPr>
-      <w:r>
-        <w:rPr>
-          <w:b/>
-          <w:color w:val="005EB8"/>
-        </w:rPr>
-        <w:t>2. ¿Por qué el mensaje y cada subpaquete empiezan con su longitud? ¿Y si llega un tipo desconocido?</w:t>
-      </w:r>
-    </w:p>
-    <w:p>
-      <w:pPr>
-        <w:jc w:val="both"/>
-      </w:pPr>
-      <w:r>
-        <w:t>Porque en un flujo de bytes no hay separadores: la longitud dice dónde acaba cada pieza y permite saltarla sin entenderla. Un subpaquete de tipo desconocido simplemente se salta sumando su longitud, así que el programa sigue funcionando aunque una versión nueva del robot añada datos.</w:t>
-      </w:r>
-    </w:p>
-    <w:p>
-      <w:pPr>
-        <w:keepNext/>
-        <w:spacing w:before="60" w:after="20"/>
-      </w:pPr>
-      <w:r>
-        <w:rPr>
-          <w:b/>
-          <w:color w:val="005EB8"/>
-        </w:rPr>
-        <w:t>3. ¿Qué pasa si se decodifica q_actual sin big-endian?</w:t>
-      </w:r>
-    </w:p>
-    <w:p>
-      <w:pPr>
-        <w:jc w:val="both"/>
-      </w:pPr>
-      <w:r>
-        <w:t xml:space="preserve">Se obtienen valores absurdos, porque los bytes se leen en orden inverso. Ejemplo: −1,5708 rad (−90°) se envía como </w:t>
-      </w:r>
-      <w:r>
-        <w:rPr>
-          <w:rFonts w:ascii="Consolas" w:hAnsi="Consolas"/>
-          <w:sz w:val="18"/>
-        </w:rPr>
-        <w:t>BF F9 21 FF 2E 48 E8 A7</w:t>
-      </w:r>
-      <w:r>
-        <w:t xml:space="preserve">; leído en little-endian (el orden del PC) da −1,9·10⁻¹¹⁶, un número sin sentido. Por eso se usa </w:t>
-      </w:r>
-      <w:r>
-        <w:rPr>
-          <w:rFonts w:ascii="Consolas" w:hAnsi="Consolas"/>
-          <w:sz w:val="18"/>
-        </w:rPr>
-        <w:t>struct</w:t>
-      </w:r>
-      <w:r>
-        <w:t xml:space="preserve"> con </w:t>
-      </w:r>
-      <w:r>
-        <w:rPr>
-          <w:rFonts w:ascii="Consolas" w:hAnsi="Consolas"/>
-          <w:sz w:val="18"/>
-        </w:rPr>
-        <w:t>&gt;</w:t>
-      </w:r>
-      <w:r>
-        <w:t xml:space="preserve"> (big-endian).</w:t>
-      </w:r>
-    </w:p>
-    <w:p>
-      <w:pPr>
-        <w:keepNext/>
-        <w:spacing w:before="60" w:after="20"/>
-      </w:pPr>
-      <w:r>
-        <w:rPr>
-          <w:b/>
-          <w:color w:val="005EB8"/>
-        </w:rPr>
-        <w:t>4. Primaria frente a tiempo real: ¿cuál para cada uso?</w:t>
-      </w:r>
-    </w:p>
-    <w:p>
-      <w:pPr>
-        <w:jc w:val="both"/>
-      </w:pPr>
-      <w:r>
-        <w:t xml:space="preserve">La </w:t>
-      </w:r>
-      <w:r>
-        <w:rPr>
-          <w:b/>
-        </w:rPr>
-        <w:t>primaria</w:t>
-      </w:r>
-      <w:r>
-        <w:t xml:space="preserve"> envía 10 veces por segundo, con mensajes por tipos que incluyen errores y avisos, y acepta órdenes: poco tráfico y mucha información. La de </w:t>
-      </w:r>
-      <w:r>
-        <w:rPr>
-          <w:b/>
-        </w:rPr>
-        <w:t>tiempo real</w:t>
-      </w:r>
-      <w:r>
-        <w:t xml:space="preserve"> envía unas 500 veces por segundo una estructura fija: más precisión y menos retraso, pero unas 50 veces más tráfico. Para un </w:t>
-      </w:r>
-      <w:r>
-        <w:rPr>
-          <w:b/>
-        </w:rPr>
-        <w:t>panel de supervisión</w:t>
-      </w:r>
-      <w:r>
-        <w:t xml:space="preserve">, la primaria (10 Hz basta y trae los errores). Para </w:t>
-      </w:r>
-      <w:r>
-        <w:rPr>
-          <w:b/>
-        </w:rPr>
-        <w:t>registrar la trayectoria de un movimiento rápido</w:t>
-      </w:r>
-      <w:r>
-        <w:t>, la de tiempo real (un dato cada 2 ms).</w:t>
-      </w:r>
-    </w:p>
-    <w:p>
-      <w:pPr>
-        <w:keepNext/>
-        <w:spacing w:before="60" w:after="20"/>
-      </w:pPr>
-      <w:r>
-        <w:rPr>
-          <w:b/>
-          <w:color w:val="005EB8"/>
-        </w:rPr>
-        <w:t>5. ¿Por qué con NAT no se puede conectar a URSim y en modo puente sí? ¿Quién ve la MAC de la VM?</w:t>
-      </w:r>
-    </w:p>
-    <w:p>
-      <w:pPr>
-        <w:jc w:val="both"/>
-      </w:pPr>
-      <w:r>
-        <w:t>Con NAT, VirtualBox esconde la máquina virtual detrás de su propia red privada: solo puede iniciar conexiones hacia fuera y desde el PC no hay una IP a la que llegar (haría falta redirigir puertos). En modo puente la VM se conecta a la red del laboratorio como un equipo más, con su propia IP (10.172.18.67). Su MAC la ven el switch del laboratorio y los equipos del mismo segmento de red (por ejemplo, nuestro PC en su tabla ARP); el router no la propaga más allá.</w:t>
-      </w:r>
-    </w:p>
-    <w:p>
-      <w:pPr>
-        <w:keepNext/>
-        <w:spacing w:before="60" w:after="20"/>
-      </w:pPr>
-      <w:r>
-        <w:rPr>
-          <w:b/>
-          <w:color w:val="005EB8"/>
-        </w:rPr>
-        <w:t>6. Si se desconecta la red 5 s, ¿qué hace el programa y qué hace TCP?</w:t>
-      </w:r>
-    </w:p>
-    <w:p>
-      <w:pPr>
-        <w:jc w:val="both"/>
-      </w:pPr>
-      <w:r>
-        <w:t>Se probó cortando la red con el cortafuegos (equivale a quitar el cable para TCP). TCP no pierde nada: el robot guarda y reenvía los datos pendientes, y al volver la red llegan de golpe (en un corte de 1,6 s llegaron 12 estados seguidos, ya atrasados). Nuestro programa espera como máximo 5 s sin datos: si el corte los supera, da la conexión por perdida, reconecta a los 2 s y sigue con datos frescos en lugar de dibujar los atrasados.</w:t>
-      </w:r>
-    </w:p>
-    <w:p>
-      <w:pPr>
-        <w:keepNext/>
-        <w:spacing w:before="60" w:after="20"/>
-      </w:pPr>
-      <w:r>
-        <w:rPr>
-          <w:b/>
-          <w:color w:val="005EB8"/>
-        </w:rPr>
-        <w:t>7. (N) Retraso entre URSim y el robot simulado con cada interfaz.</w:t>
-      </w:r>
-    </w:p>
-    <w:p>
-      <w:pPr>
-        <w:jc w:val="both"/>
-      </w:pPr>
-      <w:r>
-        <w:t xml:space="preserve">Medido desde que se envía un </w:t>
-      </w:r>
-      <w:r>
-        <w:rPr>
-          <w:rFonts w:ascii="Consolas" w:hAnsi="Consolas"/>
-          <w:sz w:val="18"/>
-        </w:rPr>
-        <w:t>movej</w:t>
-      </w:r>
-      <w:r>
-        <w:t xml:space="preserve"> hasta que se ve cambiar el ángulo (4 movimientos): </w:t>
-      </w:r>
-      <w:r>
-        <w:rPr>
-          <w:b/>
-        </w:rPr>
-        <w:t>tiempo real 61 ms</w:t>
-      </w:r>
-      <w:r>
-        <w:t xml:space="preserve">, </w:t>
-      </w:r>
-      <w:r>
-        <w:rPr>
-          <w:b/>
-        </w:rPr>
-        <w:t>primaria 123 ms</w:t>
-      </w:r>
-      <w:r>
-        <w:t xml:space="preserve"> de media (105–132 ms). Unos 60 ms son lo que tarda el robot en arrancar el programa; la diferencia, unos 60 ms, se debe a que la primaria solo publica cada 100 ms. A esto se suma hasta 33 ms del dibujo a 30 FPS. Depende del periodo de publicación, del ritmo de dibujo, de la red y de la carga del PC y de la VM.</w:t>
-      </w:r>
-    </w:p>
-    <w:p>
-      <w:pPr>
-        <w:keepNext/>
-        <w:spacing w:before="60" w:after="20"/>
-      </w:pPr>
-      <w:r>
-        <w:rPr>
-          <w:b/>
-          <w:color w:val="005EB8"/>
-        </w:rPr>
-        <w:t>8. (N) ¿Qué ocurriría sin Lock?</w:t>
-      </w:r>
-    </w:p>
-    <w:p>
-      <w:pPr>
-        <w:jc w:val="both"/>
-      </w:pPr>
-      <w:r>
-        <w:t>El bucle de dibujo podría leer el estado mientras un hilo lo escribe y mezclar datos de dos instantes (ángulos de un paquete con la marca de tiempo de otro), o fallar al copiar el diccionario compartido justo cuando otro hilo añade un robot (</w:t>
-      </w:r>
-      <w:r>
-        <w:rPr>
-          <w:rFonts w:ascii="Consolas" w:hAnsi="Consolas"/>
-          <w:sz w:val="18"/>
-        </w:rPr>
-        <w:t>dictionary changed size during iteration</w:t>
-      </w:r>
-      <w:r>
-        <w:t>). Son fallos raros e imprevisibles; el Lock garantiza que se lee siempre un estado completo.</w:t>
-      </w:r>
-    </w:p>
-    <w:p>
-      <w:pPr>
-        <w:keepNext/>
-        <w:spacing w:before="60" w:after="20"/>
-      </w:pPr>
-      <w:r>
-        <w:rPr>
-          <w:b/>
-          <w:color w:val="005EB8"/>
-        </w:rPr>
-        <w:t>9. (S) ¿Por qué enviar un movej no basta para saber que el robot ha llegado?</w:t>
-      </w:r>
-    </w:p>
-    <w:p>
-      <w:pPr>
-        <w:jc w:val="both"/>
-      </w:pPr>
-      <w:r>
-        <w:t xml:space="preserve">Porque el robot no responde a las órdenes: la orden puede rechazarse (error de sintaxis, robot en modo local), interrumpirse (parada de protección, </w:t>
-      </w:r>
-      <w:r>
-        <w:rPr>
-          <w:rFonts w:ascii="Consolas" w:hAnsi="Consolas"/>
-          <w:sz w:val="18"/>
-        </w:rPr>
-        <w:t>stopj</w:t>
-      </w:r>
-      <w:r>
-        <w:t xml:space="preserve">) o tardar. Se confirma con el propio estado del robot: </w:t>
-      </w:r>
-      <w:r>
-        <w:rPr>
-          <w:rFonts w:ascii="Consolas" w:hAnsi="Consolas"/>
-          <w:sz w:val="18"/>
-        </w:rPr>
-        <w:t>isProgramRunning</w:t>
-      </w:r>
-      <w:r>
-        <w:t xml:space="preserve"> pasa a verdadero (aceptada) y luego a falso (terminada), </w:t>
-      </w:r>
-      <w:r>
-        <w:rPr>
-          <w:rFonts w:ascii="Consolas" w:hAnsi="Consolas"/>
-          <w:sz w:val="18"/>
-        </w:rPr>
-        <w:t>q_actual</w:t>
-      </w:r>
-      <w:r>
-        <w:t xml:space="preserve"> queda a menos de 0,01 rad del objetivo, y no han llegado mensajes de error (tipo 20) ni </w:t>
-      </w:r>
-      <w:r>
-        <w:rPr>
-          <w:rFonts w:ascii="Consolas" w:hAnsi="Consolas"/>
-          <w:sz w:val="18"/>
-        </w:rPr>
-        <w:t>isProtectiveStopped</w:t>
-      </w:r>
-      <w:r>
-        <w:t>. Si el programa no arranca en 2 s, se da la orden por rechazada.</w:t>
-      </w:r>
-    </w:p>
-    <w:p>
-      <w:pPr>
-        <w:keepNext/>
-        <w:spacing w:before="60" w:after="20"/>
-      </w:pPr>
-      <w:r>
-        <w:rPr>
-          <w:b/>
-          <w:color w:val="005EB8"/>
-        </w:rPr>
-        <w:t>10. (S) Riesgo de que cualquiera pueda enviar programas al puerto 30001 y dos medidas.</w:t>
-      </w:r>
-    </w:p>
-    <w:p>
-      <w:pPr>
-        <w:jc w:val="both"/>
-      </w:pPr>
-      <w:r>
-        <w:t xml:space="preserve">No hay autenticación ni cifrado: cualquier equipo de la red (un portátil infectado, un error de otro programa) podría mover el robot con personas cerca, parar la producción o dañar el equipo. Medidas: (1) </w:t>
-      </w:r>
-      <w:r>
-        <w:rPr>
-          <w:b/>
-        </w:rPr>
-        <w:t>en el robot</w:t>
-      </w:r>
-      <w:r>
-        <w:t xml:space="preserve">, en los ajustes de seguridad de PolyScope desactivar o restringir los servicios entrantes (30001/30002/30003) y usar el modo Local o contraseña, dejando para supervisión solo interfaces de lectura como 30011; (2) </w:t>
-      </w:r>
-      <w:r>
-        <w:rPr>
-          <w:b/>
-        </w:rPr>
-        <w:t>en la red</w:t>
-      </w:r>
-      <w:r>
-        <w:t>, aislar los robots en una VLAN o segmento propio tras un cortafuegos que solo permita conectarse a los puertos de control desde la IP del equipo autorizado (zonas y conductos de IEC 62443).</w:t>
+        <w:t>[Completar tras la sesión: qué UR3e se usó y diferencias con URSim.]</w:t>
       </w:r>
     </w:p>
     <w:sectPr>
       <w:headerReference w:type="default" r:id="rId9"/>
       <w:footerReference w:type="default" r:id="rId10"/>
       <w:pgSz w:w="11906" w:h="16838"/>
-      <w:pgMar w:top="1304" w:right="1077" w:bottom="907" w:left="1077" w:header="397" w:footer="397" w:gutter="0"/>
+      <w:pgMar w:top="1474" w:right="1134" w:bottom="1020" w:left="1134" w:header="454" w:footer="454" w:gutter="0"/>
       <w:cols w:space="720"/>
       <w:docGrid w:linePitch="360"/>
     </w:sectPr>
@@ -1152,13 +951,15 @@
     </w:pPr>
     <w:r>
       <w:rPr>
-        <w:sz w:val="16"/>
+        <w:color w:val="555555"/>
+        <w:sz w:val="18"/>
       </w:rPr>
       <w:t xml:space="preserve">Página </w:t>
     </w:r>
     <w:r>
       <w:rPr>
-        <w:sz w:val="16"/>
+        <w:color w:val="555555"/>
+        <w:sz w:val="18"/>
       </w:rPr>
       <w:fldChar w:fldCharType="begin"/>
       <w:instrText xml:space="preserve"> PAGE </w:instrText>
@@ -1168,13 +969,15 @@
     </w:r>
     <w:r>
       <w:rPr>
-        <w:sz w:val="16"/>
+        <w:color w:val="555555"/>
+        <w:sz w:val="18"/>
       </w:rPr>
       <w:t xml:space="preserve"> de </w:t>
     </w:r>
     <w:r>
       <w:rPr>
-        <w:sz w:val="16"/>
+        <w:color w:val="555555"/>
+        <w:sz w:val="18"/>
       </w:rPr>
       <w:fldChar w:fldCharType="begin"/>
       <w:instrText xml:space="preserve"> NUMPAGES </w:instrText>
@@ -1198,7 +1001,6 @@
     <w:tblPr>
       <w:tblW w:type="auto" w:w="0"/>
       <w:tblLook w:firstColumn="1" w:firstRow="1" w:lastColumn="0" w:lastRow="0" w:noHBand="0" w:noVBand="1" w:val="04A0"/>
-      <w:jc w:val="center"/>
       <w:tblBorders>
         <w:top w:val="nil"/>
         <w:left w:val="nil"/>
@@ -1209,19 +1011,19 @@
       </w:tblBorders>
     </w:tblPr>
     <w:tblGrid>
-      <w:gridCol w:w="4876"/>
-      <w:gridCol w:w="4876"/>
+      <w:gridCol w:w="4819"/>
+      <w:gridCol w:w="4819"/>
     </w:tblGrid>
     <w:tr>
       <w:tc>
         <w:tcPr>
-          <w:tcW w:type="dxa" w:w="4876"/>
+          <w:tcW w:type="dxa" w:w="4819"/>
         </w:tcPr>
         <w:p>
           <w:r>
             <w:drawing>
               <wp:inline xmlns:a="http://schemas.openxmlformats.org/drawingml/2006/main" xmlns:pic="http://schemas.openxmlformats.org/drawingml/2006/picture">
-                <wp:extent cx="809036" cy="413999"/>
+                <wp:extent cx="844214" cy="432000"/>
                 <wp:docPr id="1" name="Picture 1"/>
                 <wp:cNvGraphicFramePr>
                   <a:graphicFrameLocks noChangeAspect="1"/>
@@ -1242,7 +1044,7 @@
                       <pic:spPr>
                         <a:xfrm>
                           <a:off x="0" y="0"/>
-                          <a:ext cx="809036" cy="413999"/>
+                          <a:ext cx="844214" cy="432000"/>
                         </a:xfrm>
                         <a:prstGeom prst="rect"/>
                       </pic:spPr>
@@ -1256,7 +1058,7 @@
       </w:tc>
       <w:tc>
         <w:tcPr>
-          <w:tcW w:type="dxa" w:w="4876"/>
+          <w:tcW w:type="dxa" w:w="4819"/>
         </w:tcPr>
         <w:p>
           <w:pPr>
@@ -1265,7 +1067,7 @@
           <w:r>
             <w:rPr>
               <w:b/>
-              <w:sz w:val="18"/>
+              <w:sz w:val="20"/>
             </w:rPr>
             <w:t>Daniel López Farray</w:t>
             <w:br/>
@@ -1273,7 +1075,7 @@
           <w:r>
             <w:rPr>
               <w:color w:val="555555"/>
-              <w:sz w:val="16"/>
+              <w:sz w:val="17"/>
             </w:rPr>
             <w:t>Redes de Comunicación Industriales</w:t>
             <w:br/>
@@ -1286,7 +1088,7 @@
   <w:p>
     <w:pPr>
       <w:pBdr>
-        <w:bottom w:val="single" w:sz="6" w:space="1" w:color="005EB8"/>
+        <w:bottom w:val="single" w:sz="8" w:space="1" w:color="005EB8"/>
       </w:pBdr>
     </w:pPr>
   </w:p>
@@ -1657,11 +1459,11 @@
     <w:qFormat/>
     <w:rsid w:val="00FC693F"/>
     <w:pPr>
-      <w:spacing w:after="60" w:line="240" w:lineRule="auto"/>
+      <w:spacing w:after="80" w:line="259" w:lineRule="auto"/>
     </w:pPr>
     <w:rPr>
       <w:rFonts w:ascii="Calibri" w:hAnsi="Calibri" w:eastAsia="Calibri"/>
-      <w:sz w:val="20"/>
+      <w:sz w:val="22"/>
     </w:rPr>
   </w:style>
   <w:style w:type="paragraph" w:styleId="Header">

</xml_diff>

<commit_message>
docs: memoria organizada por ejercicios (A, B, C y D), cada uno con su figura
Co-Authored-By: Claude Opus 5.5 <noreply@anthropic.com>
</commit_message>
<xml_diff>
--- a/memoria/memoria.docx
+++ b/memoria/memoria.docx
@@ -28,6 +28,38 @@
       </w:r>
     </w:p>
     <w:p>
+      <w:r>
+        <w:t xml:space="preserve">Cuatro programas que leen por la red el estado de un brazo </w:t>
+      </w:r>
+      <w:r>
+        <w:rPr>
+          <w:b/>
+        </w:rPr>
+        <w:t>UR3e</w:t>
+      </w:r>
+      <w:r>
+        <w:t xml:space="preserve"> (real o URSim) y lo muestran en 3D con </w:t>
+      </w:r>
+      <w:r>
+        <w:rPr>
+          <w:b/>
+        </w:rPr>
+        <w:t>PyBullet</w:t>
+      </w:r>
+      <w:r>
+        <w:t xml:space="preserve">, de menos a más: una interfaz, otra más rápida, varios robots y, por último, una aplicación que además da órdenes al robot. Todos se lanzan con F5 y leen las IP de </w:t>
+      </w:r>
+      <w:r>
+        <w:rPr>
+          <w:rFonts w:ascii="Consolas" w:hAnsi="Consolas"/>
+        </w:rPr>
+        <w:t>robots.json</w:t>
+      </w:r>
+      <w:r>
+        <w:t>.</w:t>
+      </w:r>
+    </w:p>
+    <w:p>
       <w:pPr>
         <w:keepNext/>
         <w:spacing w:before="200" w:after="60"/>
@@ -38,39 +70,7 @@
           <w:color w:val="005EB8"/>
           <w:sz w:val="28"/>
         </w:rPr>
-        <w:t>1. Qué hace</w:t>
-      </w:r>
-    </w:p>
-    <w:p>
-      <w:r>
-        <w:t xml:space="preserve">Lee por la red el estado de un brazo </w:t>
-      </w:r>
-      <w:r>
-        <w:rPr>
-          <w:b/>
-        </w:rPr>
-        <w:t>UR3e</w:t>
-      </w:r>
-      <w:r>
-        <w:t xml:space="preserve"> (real o simulado con URSim) y lo reproduce en 3D con </w:t>
-      </w:r>
-      <w:r>
-        <w:rPr>
-          <w:b/>
-        </w:rPr>
-        <w:t>PyBullet</w:t>
-      </w:r>
-      <w:r>
-        <w:t xml:space="preserve">. Encima, una mini-aplicación permite </w:t>
-      </w:r>
-      <w:r>
-        <w:rPr>
-          <w:b/>
-        </w:rPr>
-        <w:t>enseñar posturas</w:t>
-      </w:r>
-      <w:r>
-        <w:t xml:space="preserve"> al robot y repetirlas.</w:t>
+        <w:t>A · Interfaz primaria (primaria.py)</w:t>
       </w:r>
     </w:p>
     <w:p>
@@ -82,7 +82,7 @@
       <w:r>
         <w:drawing>
           <wp:inline xmlns:a="http://schemas.openxmlformats.org/drawingml/2006/main" xmlns:pic="http://schemas.openxmlformats.org/drawingml/2006/picture">
-            <wp:extent cx="5220000" cy="2852791"/>
+            <wp:extent cx="4860000" cy="2045712"/>
             <wp:docPr id="1" name="Picture 1"/>
             <wp:cNvGraphicFramePr>
               <a:graphicFrameLocks noChangeAspect="1"/>
@@ -91,7 +91,7 @@
               <a:graphicData uri="http://schemas.openxmlformats.org/drawingml/2006/picture">
                 <pic:pic>
                   <pic:nvPicPr>
-                    <pic:cNvPr id="0" name="captura.png"/>
+                    <pic:cNvPr id="0" name="mensaje.png"/>
                     <pic:cNvPicPr/>
                   </pic:nvPicPr>
                   <pic:blipFill>
@@ -103,7 +103,7 @@
                   <pic:spPr>
                     <a:xfrm>
                       <a:off x="0" y="0"/>
-                      <a:ext cx="5220000" cy="2852791"/>
+                      <a:ext cx="4860000" cy="2045712"/>
                     </a:xfrm>
                     <a:prstGeom prst="rect"/>
                   </pic:spPr>
@@ -125,190 +125,7 @@
           <w:color w:val="555555"/>
           <w:sz w:val="19"/>
         </w:rPr>
-        <w:t>Fig. 1 · Aplicación conectada a URSim. Gris: el robot. Azul: el punto que va a ejecutar («fantasma»).</w:t>
-      </w:r>
-    </w:p>
-    <w:p>
-      <w:pPr>
-        <w:keepNext/>
-        <w:spacing w:before="200" w:after="60"/>
-      </w:pPr>
-      <w:r>
-        <w:rPr>
-          <w:b/>
-          <w:color w:val="005EB8"/>
-          <w:sz w:val="28"/>
-        </w:rPr>
-        <w:t>2. Arquitectura</w:t>
-      </w:r>
-    </w:p>
-    <w:p>
-      <w:pPr>
-        <w:keepNext/>
-        <w:spacing w:before="80" w:after="40"/>
-        <w:jc w:val="center"/>
-      </w:pPr>
-      <w:r>
-        <w:drawing>
-          <wp:inline xmlns:a="http://schemas.openxmlformats.org/drawingml/2006/main" xmlns:pic="http://schemas.openxmlformats.org/drawingml/2006/picture">
-            <wp:extent cx="5400000" cy="2128560"/>
-            <wp:docPr id="2" name="Picture 2"/>
-            <wp:cNvGraphicFramePr>
-              <a:graphicFrameLocks noChangeAspect="1"/>
-            </wp:cNvGraphicFramePr>
-            <a:graphic>
-              <a:graphicData uri="http://schemas.openxmlformats.org/drawingml/2006/picture">
-                <pic:pic>
-                  <pic:nvPicPr>
-                    <pic:cNvPr id="0" name="arquitectura.png"/>
-                    <pic:cNvPicPr/>
-                  </pic:nvPicPr>
-                  <pic:blipFill>
-                    <a:blip r:embed="rId12"/>
-                    <a:stretch>
-                      <a:fillRect/>
-                    </a:stretch>
-                  </pic:blipFill>
-                  <pic:spPr>
-                    <a:xfrm>
-                      <a:off x="0" y="0"/>
-                      <a:ext cx="5400000" cy="2128560"/>
-                    </a:xfrm>
-                    <a:prstGeom prst="rect"/>
-                  </pic:spPr>
-                </pic:pic>
-              </a:graphicData>
-            </a:graphic>
-          </wp:inline>
-        </w:drawing>
-      </w:r>
-    </w:p>
-    <w:p>
-      <w:pPr>
-        <w:spacing w:after="160"/>
-        <w:jc w:val="center"/>
-      </w:pPr>
-      <w:r>
-        <w:rPr>
-          <w:i/>
-          <w:color w:val="555555"/>
-          <w:sz w:val="19"/>
-        </w:rPr>
-        <w:t>Fig. 2 · Quién hace qué: recibir, guardar el último estado y dibujar.</w:t>
-      </w:r>
-    </w:p>
-    <w:p>
-      <w:pPr>
-        <w:pStyle w:val="ListBullet"/>
-        <w:spacing w:after="40"/>
-      </w:pPr>
-      <w:r>
-        <w:rPr>
-          <w:b/>
-        </w:rPr>
-        <w:t>Un hilo por robot solo recibe.</w:t>
-      </w:r>
-      <w:r>
-        <w:t xml:space="preserve"> Si un robot se cuelga, solo se bloquea su hilo.</w:t>
-      </w:r>
-    </w:p>
-    <w:p>
-      <w:pPr>
-        <w:pStyle w:val="ListBullet"/>
-        <w:spacing w:after="40"/>
-      </w:pPr>
-      <w:r>
-        <w:rPr>
-          <w:b/>
-        </w:rPr>
-        <w:t>Un único bucle dibuja y envía órdenes.</w:t>
-      </w:r>
-      <w:r>
-        <w:t xml:space="preserve"> PyBullet nunca se usa desde dos hilos.</w:t>
-      </w:r>
-    </w:p>
-    <w:p>
-      <w:pPr>
-        <w:pStyle w:val="ListBullet"/>
-        <w:spacing w:after="40"/>
-      </w:pPr>
-      <w:r>
-        <w:rPr>
-          <w:b/>
-        </w:rPr>
-        <w:t>Lock</w:t>
-      </w:r>
-      <w:r>
-        <w:t xml:space="preserve"> en el estado compartido: nunca se lee un estado a medio escribir.</w:t>
-      </w:r>
-    </w:p>
-    <w:p>
-      <w:pPr>
-        <w:keepNext/>
-        <w:spacing w:before="200" w:after="60"/>
-      </w:pPr>
-      <w:r>
-        <w:rPr>
-          <w:b/>
-          <w:color w:val="005EB8"/>
-          <w:sz w:val="28"/>
-        </w:rPr>
-        <w:t>3. Leer un flujo TCP</w:t>
-      </w:r>
-    </w:p>
-    <w:p>
-      <w:pPr>
-        <w:keepNext/>
-        <w:spacing w:before="80" w:after="40"/>
-        <w:jc w:val="center"/>
-      </w:pPr>
-      <w:r>
-        <w:drawing>
-          <wp:inline xmlns:a="http://schemas.openxmlformats.org/drawingml/2006/main" xmlns:pic="http://schemas.openxmlformats.org/drawingml/2006/picture">
-            <wp:extent cx="5400000" cy="2273013"/>
-            <wp:docPr id="3" name="Picture 3"/>
-            <wp:cNvGraphicFramePr>
-              <a:graphicFrameLocks noChangeAspect="1"/>
-            </wp:cNvGraphicFramePr>
-            <a:graphic>
-              <a:graphicData uri="http://schemas.openxmlformats.org/drawingml/2006/picture">
-                <pic:pic>
-                  <pic:nvPicPr>
-                    <pic:cNvPr id="0" name="mensaje.png"/>
-                    <pic:cNvPicPr/>
-                  </pic:nvPicPr>
-                  <pic:blipFill>
-                    <a:blip r:embed="rId13"/>
-                    <a:stretch>
-                      <a:fillRect/>
-                    </a:stretch>
-                  </pic:blipFill>
-                  <pic:spPr>
-                    <a:xfrm>
-                      <a:off x="0" y="0"/>
-                      <a:ext cx="5400000" cy="2273013"/>
-                    </a:xfrm>
-                    <a:prstGeom prst="rect"/>
-                  </pic:spPr>
-                </pic:pic>
-              </a:graphicData>
-            </a:graphic>
-          </wp:inline>
-        </w:drawing>
-      </w:r>
-    </w:p>
-    <w:p>
-      <w:pPr>
-        <w:spacing w:after="160"/>
-        <w:jc w:val="center"/>
-      </w:pPr>
-      <w:r>
-        <w:rPr>
-          <w:i/>
-          <w:color w:val="555555"/>
-          <w:sz w:val="19"/>
-        </w:rPr>
-        <w:t>Fig. 3 · De los bytes que llegan por TCP a los 6 ángulos del robot.</w:t>
+        <w:t>Fig. 1 · De los bytes que llegan por TCP a los 6 ángulos del robot.</w:t>
       </w:r>
     </w:p>
     <w:p>
@@ -341,13 +158,16 @@
         <w:spacing w:after="40"/>
       </w:pPr>
       <w:r>
+        <w:t xml:space="preserve">Del mensaje de estado (tipo 16) solo interesa el </w:t>
+      </w:r>
+      <w:r>
         <w:rPr>
           <w:b/>
         </w:rPr>
-        <w:t>Subpaquetes que no interesan:</w:t>
+        <w:t>subpaquete 1</w:t>
       </w:r>
       <w:r>
-        <w:t xml:space="preserve"> se saltan sumando su longitud, sin entenderlos.</w:t>
+        <w:t>; los demás se saltan con su longitud.</w:t>
       </w:r>
     </w:p>
     <w:p>
@@ -356,19 +176,31 @@
         <w:spacing w:after="40"/>
       </w:pPr>
       <w:r>
+        <w:t xml:space="preserve">Números en </w:t>
+      </w:r>
+      <w:r>
         <w:rPr>
           <w:b/>
         </w:rPr>
-        <w:t>Big-endian:</w:t>
+        <w:t>big-endian</w:t>
       </w:r>
       <w:r>
-        <w:t xml:space="preserve"> el robot ordena los bytes al revés que el PC; se indica con </w:t>
+        <w:t xml:space="preserve"> (</w:t>
       </w:r>
       <w:r>
         <w:rPr>
           <w:rFonts w:ascii="Consolas" w:hAnsi="Consolas"/>
         </w:rPr>
         <w:t>&gt;</w:t>
+      </w:r>
+      <w:r>
+        <w:t xml:space="preserve">). Si se corta la conexión, </w:t>
+      </w:r>
+      <w:r>
+        <w:rPr>
+          <w:b/>
+        </w:rPr>
+        <w:t>reconecta solo</w:t>
       </w:r>
       <w:r>
         <w:t>.</w:t>
@@ -385,325 +217,7 @@
           <w:color w:val="005EB8"/>
           <w:sz w:val="28"/>
         </w:rPr>
-        <w:t>4. Las cuatro tareas</w:t>
-      </w:r>
-    </w:p>
-    <w:tbl>
-      <w:tblPr>
-        <w:tblStyle w:val="TableGrid"/>
-        <w:tblW w:type="auto" w:w="0"/>
-        <w:jc w:val="center"/>
-        <w:tblLook w:firstColumn="1" w:firstRow="1" w:lastColumn="0" w:lastRow="0" w:noHBand="0" w:noVBand="1" w:val="04A0"/>
-      </w:tblPr>
-      <w:tblGrid>
-        <w:gridCol w:w="3213"/>
-        <w:gridCol w:w="3213"/>
-        <w:gridCol w:w="3213"/>
-      </w:tblGrid>
-      <w:tr>
-        <w:tc>
-          <w:tcPr>
-            <w:tcW w:type="dxa" w:w="2268"/>
-            <w:shd w:val="clear" w:fill="005EB8"/>
-          </w:tcPr>
-          <w:p>
-            <w:pPr>
-              <w:spacing w:after="20" w:before="20"/>
-            </w:pPr>
-            <w:r>
-              <w:rPr>
-                <w:b/>
-                <w:color w:val="FFFFFF"/>
-                <w:sz w:val="20"/>
-              </w:rPr>
-              <w:t>Tarea</w:t>
-            </w:r>
-          </w:p>
-        </w:tc>
-        <w:tc>
-          <w:tcPr>
-            <w:tcW w:type="dxa" w:w="2494"/>
-            <w:shd w:val="clear" w:fill="005EB8"/>
-          </w:tcPr>
-          <w:p>
-            <w:pPr>
-              <w:spacing w:after="20" w:before="20"/>
-            </w:pPr>
-            <w:r>
-              <w:rPr>
-                <w:b/>
-                <w:color w:val="FFFFFF"/>
-                <w:sz w:val="20"/>
-              </w:rPr>
-              <w:t>Script</w:t>
-            </w:r>
-          </w:p>
-        </w:tc>
-        <w:tc>
-          <w:tcPr>
-            <w:tcW w:type="dxa" w:w="4876"/>
-            <w:shd w:val="clear" w:fill="005EB8"/>
-          </w:tcPr>
-          <w:p>
-            <w:pPr>
-              <w:spacing w:after="20" w:before="20"/>
-            </w:pPr>
-            <w:r>
-              <w:rPr>
-                <w:b/>
-                <w:color w:val="FFFFFF"/>
-                <w:sz w:val="20"/>
-              </w:rPr>
-              <w:t>Idea clave</w:t>
-            </w:r>
-          </w:p>
-        </w:tc>
-      </w:tr>
-      <w:tr>
-        <w:tc>
-          <w:tcPr>
-            <w:tcW w:type="dxa" w:w="2268"/>
-          </w:tcPr>
-          <w:p>
-            <w:pPr>
-              <w:spacing w:after="20" w:before="20"/>
-            </w:pPr>
-            <w:r>
-              <w:rPr>
-                <w:sz w:val="20"/>
-              </w:rPr>
-              <w:t>A · Primaria</w:t>
-            </w:r>
-          </w:p>
-        </w:tc>
-        <w:tc>
-          <w:tcPr>
-            <w:tcW w:type="dxa" w:w="2494"/>
-          </w:tcPr>
-          <w:p>
-            <w:pPr>
-              <w:spacing w:after="20" w:before="20"/>
-            </w:pPr>
-            <w:r>
-              <w:rPr>
-                <w:rFonts w:ascii="Consolas" w:hAnsi="Consolas"/>
-                <w:sz w:val="20"/>
-              </w:rPr>
-              <w:t>primaria.py</w:t>
-            </w:r>
-          </w:p>
-        </w:tc>
-        <w:tc>
-          <w:tcPr>
-            <w:tcW w:type="dxa" w:w="4876"/>
-          </w:tcPr>
-          <w:p>
-            <w:pPr>
-              <w:spacing w:after="20" w:before="20"/>
-            </w:pPr>
-            <w:r>
-              <w:rPr>
-                <w:sz w:val="20"/>
-              </w:rPr>
-              <w:t>Puerto 30001 · 10 estados/s · ángulos del subpaquete 1</w:t>
-            </w:r>
-          </w:p>
-        </w:tc>
-      </w:tr>
-      <w:tr>
-        <w:tc>
-          <w:tcPr>
-            <w:tcW w:type="dxa" w:w="2268"/>
-          </w:tcPr>
-          <w:p>
-            <w:pPr>
-              <w:spacing w:after="20" w:before="20"/>
-            </w:pPr>
-            <w:r>
-              <w:rPr>
-                <w:sz w:val="20"/>
-              </w:rPr>
-              <w:t>B · Tiempo real</w:t>
-            </w:r>
-          </w:p>
-        </w:tc>
-        <w:tc>
-          <w:tcPr>
-            <w:tcW w:type="dxa" w:w="2494"/>
-          </w:tcPr>
-          <w:p>
-            <w:pPr>
-              <w:spacing w:after="20" w:before="20"/>
-            </w:pPr>
-            <w:r>
-              <w:rPr>
-                <w:rFonts w:ascii="Consolas" w:hAnsi="Consolas"/>
-                <w:sz w:val="20"/>
-              </w:rPr>
-              <w:t>tiempo_real.py</w:t>
-            </w:r>
-          </w:p>
-        </w:tc>
-        <w:tc>
-          <w:tcPr>
-            <w:tcW w:type="dxa" w:w="4876"/>
-          </w:tcPr>
-          <w:p>
-            <w:pPr>
-              <w:spacing w:after="20" w:before="20"/>
-            </w:pPr>
-            <w:r>
-              <w:rPr>
-                <w:sz w:val="20"/>
-              </w:rPr>
-              <w:t>Puerto 30003 · ~500 paquetes/s · se queda el último y dibuja 30/s</w:t>
-            </w:r>
-          </w:p>
-        </w:tc>
-      </w:tr>
-      <w:tr>
-        <w:tc>
-          <w:tcPr>
-            <w:tcW w:type="dxa" w:w="2268"/>
-          </w:tcPr>
-          <w:p>
-            <w:pPr>
-              <w:spacing w:after="20" w:before="20"/>
-            </w:pPr>
-            <w:r>
-              <w:rPr>
-                <w:sz w:val="20"/>
-              </w:rPr>
-              <w:t>C · Varios robots</w:t>
-            </w:r>
-          </w:p>
-        </w:tc>
-        <w:tc>
-          <w:tcPr>
-            <w:tcW w:type="dxa" w:w="2494"/>
-          </w:tcPr>
-          <w:p>
-            <w:pPr>
-              <w:spacing w:after="20" w:before="20"/>
-            </w:pPr>
-            <w:r>
-              <w:rPr>
-                <w:rFonts w:ascii="Consolas" w:hAnsi="Consolas"/>
-                <w:sz w:val="20"/>
-              </w:rPr>
-              <w:t>varios_robots.py</w:t>
-            </w:r>
-          </w:p>
-        </w:tc>
-        <w:tc>
-          <w:tcPr>
-            <w:tcW w:type="dxa" w:w="4876"/>
-          </w:tcPr>
-          <w:p>
-            <w:pPr>
-              <w:spacing w:after="20" w:before="20"/>
-            </w:pPr>
-            <w:r>
-              <w:rPr>
-                <w:sz w:val="20"/>
-              </w:rPr>
-              <w:t>Un hilo por robot · «SIN DATOS» en rojo si uno se cae</w:t>
-            </w:r>
-          </w:p>
-        </w:tc>
-      </w:tr>
-      <w:tr>
-        <w:tc>
-          <w:tcPr>
-            <w:tcW w:type="dxa" w:w="2268"/>
-          </w:tcPr>
-          <w:p>
-            <w:pPr>
-              <w:spacing w:after="20" w:before="20"/>
-            </w:pPr>
-            <w:r>
-              <w:rPr>
-                <w:sz w:val="20"/>
-              </w:rPr>
-              <w:t>D · Enseñar y reproducir</w:t>
-            </w:r>
-          </w:p>
-        </w:tc>
-        <w:tc>
-          <w:tcPr>
-            <w:tcW w:type="dxa" w:w="2494"/>
-          </w:tcPr>
-          <w:p>
-            <w:pPr>
-              <w:spacing w:after="20" w:before="20"/>
-            </w:pPr>
-            <w:r>
-              <w:rPr>
-                <w:rFonts w:ascii="Consolas" w:hAnsi="Consolas"/>
-                <w:sz w:val="20"/>
-              </w:rPr>
-              <w:t>ensenar_reproducir.py</w:t>
-            </w:r>
-          </w:p>
-        </w:tc>
-        <w:tc>
-          <w:tcPr>
-            <w:tcW w:type="dxa" w:w="4876"/>
-          </w:tcPr>
-          <w:p>
-            <w:pPr>
-              <w:spacing w:after="20" w:before="20"/>
-            </w:pPr>
-            <w:r>
-              <w:rPr>
-                <w:sz w:val="20"/>
-              </w:rPr>
-              <w:t>Enseñar · previsualizar · ejecutar y confirmar</w:t>
-            </w:r>
-          </w:p>
-        </w:tc>
-      </w:tr>
-    </w:tbl>
-    <w:p>
-      <w:pPr>
-        <w:spacing w:after="0"/>
-      </w:pPr>
-    </w:p>
-    <w:p>
-      <w:pPr>
-        <w:keepNext/>
-        <w:spacing w:before="200" w:after="60"/>
-      </w:pPr>
-      <w:r>
-        <w:rPr>
-          <w:b/>
-          <w:color w:val="005EB8"/>
-          <w:sz w:val="28"/>
-        </w:rPr>
-        <w:t>5. Enseñar y reproducir</w:t>
-      </w:r>
-    </w:p>
-    <w:p>
-      <w:r>
-        <w:t xml:space="preserve">Una </w:t>
-      </w:r>
-      <w:r>
-        <w:rPr>
-          <w:b/>
-        </w:rPr>
-        <w:t>máquina de estados</w:t>
-      </w:r>
-      <w:r>
-        <w:t xml:space="preserve"> lleva la secuencia. El robot no responde a un </w:t>
-      </w:r>
-      <w:r>
-        <w:rPr>
-          <w:rFonts w:ascii="Consolas" w:hAnsi="Consolas"/>
-        </w:rPr>
-        <w:t>movej</w:t>
-      </w:r>
-      <w:r>
-        <w:t>: hay que deducir del estado que publica si lo ha cumplido.</w:t>
+        <w:t>B · Interfaz de tiempo real (tiempo_real.py)</w:t>
       </w:r>
     </w:p>
     <w:p>
@@ -715,8 +229,8 @@
       <w:r>
         <w:drawing>
           <wp:inline xmlns:a="http://schemas.openxmlformats.org/drawingml/2006/main" xmlns:pic="http://schemas.openxmlformats.org/drawingml/2006/picture">
-            <wp:extent cx="4320000" cy="2012727"/>
-            <wp:docPr id="4" name="Picture 4"/>
+            <wp:extent cx="4860000" cy="1675215"/>
+            <wp:docPr id="2" name="Picture 2"/>
             <wp:cNvGraphicFramePr>
               <a:graphicFrameLocks noChangeAspect="1"/>
             </wp:cNvGraphicFramePr>
@@ -724,11 +238,11 @@
               <a:graphicData uri="http://schemas.openxmlformats.org/drawingml/2006/picture">
                 <pic:pic>
                   <pic:nvPicPr>
-                    <pic:cNvPr id="0" name="estados.png"/>
+                    <pic:cNvPr id="0" name="tiempo_real.png"/>
                     <pic:cNvPicPr/>
                   </pic:nvPicPr>
                   <pic:blipFill>
-                    <a:blip r:embed="rId14"/>
+                    <a:blip r:embed="rId12"/>
                     <a:stretch>
                       <a:fillRect/>
                     </a:stretch>
@@ -736,7 +250,7 @@
                   <pic:spPr>
                     <a:xfrm>
                       <a:off x="0" y="0"/>
-                      <a:ext cx="4320000" cy="2012727"/>
+                      <a:ext cx="4860000" cy="1675215"/>
                     </a:xfrm>
                     <a:prstGeom prst="rect"/>
                   </pic:spPr>
@@ -758,8 +272,190 @@
           <w:color w:val="555555"/>
           <w:sz w:val="19"/>
         </w:rPr>
-        <w:t>Fig. 4 · Máquina de estados de la secuencia.</w:t>
+        <w:t>Fig. 2 · Paquete del puerto 30003 y ritmo de llegada frente al de dibujo.</w:t>
       </w:r>
+    </w:p>
+    <w:p>
+      <w:pPr>
+        <w:pStyle w:val="ListBullet"/>
+        <w:spacing w:after="40"/>
+      </w:pPr>
+      <w:r>
+        <w:t xml:space="preserve">Estructura fija: los ángulos están </w:t>
+      </w:r>
+      <w:r>
+        <w:rPr>
+          <w:b/>
+        </w:rPr>
+        <w:t>siempre en el byte 252</w:t>
+      </w:r>
+      <w:r>
+        <w:t>. No hace falta recorrer subpaquetes.</w:t>
+      </w:r>
+    </w:p>
+    <w:p>
+      <w:pPr>
+        <w:pStyle w:val="ListBullet"/>
+        <w:spacing w:after="40"/>
+      </w:pPr>
+      <w:r>
+        <w:t xml:space="preserve">Llegan ~500 paquetes/s (URSim da ~480), demasiados para dibujarlos todos: se leen todos, </w:t>
+      </w:r>
+      <w:r>
+        <w:rPr>
+          <w:b/>
+        </w:rPr>
+        <w:t>se guarda solo el último</w:t>
+      </w:r>
+      <w:r>
+        <w:t xml:space="preserve"> y se dibuja 30 veces por segundo.</w:t>
+      </w:r>
+    </w:p>
+    <w:p>
+      <w:pPr>
+        <w:keepNext/>
+        <w:spacing w:before="200" w:after="60"/>
+      </w:pPr>
+      <w:r>
+        <w:rPr>
+          <w:b/>
+          <w:color w:val="005EB8"/>
+          <w:sz w:val="28"/>
+        </w:rPr>
+        <w:t>C · Varios robots (varios_robots.py)</w:t>
+      </w:r>
+    </w:p>
+    <w:tbl>
+      <w:tblPr>
+        <w:tblW w:type="auto" w:w="0"/>
+        <w:tblLook w:firstColumn="1" w:firstRow="1" w:lastColumn="0" w:lastRow="0" w:noHBand="0" w:noVBand="1" w:val="04A0"/>
+        <w:tblBorders>
+          <w:top w:val="nil"/>
+          <w:left w:val="nil"/>
+          <w:bottom w:val="nil"/>
+          <w:right w:val="nil"/>
+          <w:insideH w:val="nil"/>
+          <w:insideV w:val="nil"/>
+        </w:tblBorders>
+      </w:tblPr>
+      <w:tblGrid>
+        <w:gridCol w:w="4819"/>
+        <w:gridCol w:w="4819"/>
+      </w:tblGrid>
+      <w:tr>
+        <w:tc>
+          <w:tcPr>
+            <w:tcW w:type="dxa" w:w="4989"/>
+          </w:tcPr>
+          <w:p>
+            <w:r>
+              <w:drawing>
+                <wp:inline xmlns:a="http://schemas.openxmlformats.org/drawingml/2006/main" xmlns:pic="http://schemas.openxmlformats.org/drawingml/2006/picture">
+                  <wp:extent cx="3060000" cy="1332581"/>
+                  <wp:docPr id="3" name="Picture 3"/>
+                  <wp:cNvGraphicFramePr>
+                    <a:graphicFrameLocks noChangeAspect="1"/>
+                  </wp:cNvGraphicFramePr>
+                  <a:graphic>
+                    <a:graphicData uri="http://schemas.openxmlformats.org/drawingml/2006/picture">
+                      <pic:pic>
+                        <pic:nvPicPr>
+                          <pic:cNvPr id="0" name="captura_varios.png"/>
+                          <pic:cNvPicPr/>
+                        </pic:nvPicPr>
+                        <pic:blipFill>
+                          <a:blip r:embed="rId13"/>
+                          <a:stretch>
+                            <a:fillRect/>
+                          </a:stretch>
+                        </pic:blipFill>
+                        <pic:spPr>
+                          <a:xfrm>
+                            <a:off x="0" y="0"/>
+                            <a:ext cx="3060000" cy="1332581"/>
+                          </a:xfrm>
+                          <a:prstGeom prst="rect"/>
+                        </pic:spPr>
+                      </pic:pic>
+                    </a:graphicData>
+                  </a:graphic>
+                </wp:inline>
+              </w:drawing>
+            </w:r>
+          </w:p>
+          <w:p>
+            <w:r>
+              <w:rPr>
+                <w:i/>
+                <w:color w:val="555555"/>
+                <w:sz w:val="18"/>
+              </w:rPr>
+              <w:t>Fig. 3 · Dos URSim y un robot apagado.</w:t>
+            </w:r>
+          </w:p>
+        </w:tc>
+        <w:tc>
+          <w:tcPr>
+            <w:tcW w:type="dxa" w:w="4649"/>
+          </w:tcPr>
+          <w:p>
+            <w:pPr>
+              <w:spacing w:after="100"/>
+            </w:pPr>
+            <w:r>
+              <w:t xml:space="preserve">• </w:t>
+            </w:r>
+            <w:r>
+              <w:rPr>
+                <w:b/>
+              </w:rPr>
+              <w:t>Un hilo por robot</w:t>
+            </w:r>
+            <w:r>
+              <w:t>, cada uno con su socket y su buffer: si uno se cuelga, solo se bloquea su hilo.</w:t>
+            </w:r>
+          </w:p>
+          <w:p>
+            <w:pPr>
+              <w:spacing w:after="100"/>
+            </w:pPr>
+            <w:r>
+              <w:t xml:space="preserve">• Los hilos dejan el último estado en un diccionario protegido con un </w:t>
+            </w:r>
+            <w:r>
+              <w:rPr>
+                <w:b/>
+              </w:rPr>
+              <w:t>Lock</w:t>
+            </w:r>
+            <w:r>
+              <w:t>; un único bucle lo lee y dibuja.</w:t>
+            </w:r>
+          </w:p>
+          <w:p>
+            <w:pPr>
+              <w:spacing w:after="100"/>
+            </w:pPr>
+            <w:r>
+              <w:t xml:space="preserve">• Si un robot deja de enviar 1 s, su nombre pasa a rojo </w:t>
+            </w:r>
+            <w:r>
+              <w:rPr>
+                <w:b/>
+              </w:rPr>
+              <w:t>«SIN DATOS»</w:t>
+            </w:r>
+            <w:r>
+              <w:t xml:space="preserve"> y se queda quieto.</w:t>
+            </w:r>
+          </w:p>
+        </w:tc>
+      </w:tr>
+    </w:tbl>
+    <w:p>
+      <w:pPr>
+        <w:spacing w:after="0"/>
+      </w:pPr>
     </w:p>
     <w:p>
       <w:pPr>
@@ -770,8 +466,8 @@
       <w:r>
         <w:drawing>
           <wp:inline xmlns:a="http://schemas.openxmlformats.org/drawingml/2006/main" xmlns:pic="http://schemas.openxmlformats.org/drawingml/2006/picture">
-            <wp:extent cx="5400000" cy="2184100"/>
-            <wp:docPr id="5" name="Picture 5"/>
+            <wp:extent cx="4860000" cy="1915704"/>
+            <wp:docPr id="4" name="Picture 4"/>
             <wp:cNvGraphicFramePr>
               <a:graphicFrameLocks noChangeAspect="1"/>
             </wp:cNvGraphicFramePr>
@@ -779,11 +475,11 @@
               <a:graphicData uri="http://schemas.openxmlformats.org/drawingml/2006/picture">
                 <pic:pic>
                   <pic:nvPicPr>
-                    <pic:cNvPr id="0" name="movej.png"/>
+                    <pic:cNvPr id="0" name="arquitectura.png"/>
                     <pic:cNvPicPr/>
                   </pic:nvPicPr>
                   <pic:blipFill>
-                    <a:blip r:embed="rId15"/>
+                    <a:blip r:embed="rId14"/>
                     <a:stretch>
                       <a:fillRect/>
                     </a:stretch>
@@ -791,7 +487,7 @@
                   <pic:spPr>
                     <a:xfrm>
                       <a:off x="0" y="0"/>
-                      <a:ext cx="5400000" cy="2184100"/>
+                      <a:ext cx="4860000" cy="1915704"/>
                     </a:xfrm>
                     <a:prstGeom prst="rect"/>
                   </pic:spPr>
@@ -813,7 +509,7 @@
           <w:color w:val="555555"/>
           <w:sz w:val="19"/>
         </w:rPr>
-        <w:t>Fig. 5 · Datos reales de URSim. Un punto se da por bueno cuando el programa termina y el ángulo está a menos de 0,01 rad del objetivo.</w:t>
+        <w:t>Fig. 4 · Estructura de C y D: recibir, guardar el último estado y dibujar.</w:t>
       </w:r>
     </w:p>
     <w:p>
@@ -827,7 +523,281 @@
           <w:color w:val="005EB8"/>
           <w:sz w:val="28"/>
         </w:rPr>
-        <w:t>6. Además</w:t>
+        <w:t>D · Enseñar y reproducir (ensenar_reproducir.py)</w:t>
+      </w:r>
+    </w:p>
+    <w:tbl>
+      <w:tblPr>
+        <w:tblW w:type="auto" w:w="0"/>
+        <w:tblLook w:firstColumn="1" w:firstRow="1" w:lastColumn="0" w:lastRow="0" w:noHBand="0" w:noVBand="1" w:val="04A0"/>
+        <w:tblBorders>
+          <w:top w:val="nil"/>
+          <w:left w:val="nil"/>
+          <w:bottom w:val="nil"/>
+          <w:right w:val="nil"/>
+          <w:insideH w:val="nil"/>
+          <w:insideV w:val="nil"/>
+        </w:tblBorders>
+      </w:tblPr>
+      <w:tblGrid>
+        <w:gridCol w:w="4819"/>
+        <w:gridCol w:w="4819"/>
+      </w:tblGrid>
+      <w:tr>
+        <w:tc>
+          <w:tcPr>
+            <w:tcW w:type="dxa" w:w="4989"/>
+          </w:tcPr>
+          <w:p>
+            <w:r>
+              <w:drawing>
+                <wp:inline xmlns:a="http://schemas.openxmlformats.org/drawingml/2006/main" xmlns:pic="http://schemas.openxmlformats.org/drawingml/2006/picture">
+                  <wp:extent cx="3060000" cy="1672326"/>
+                  <wp:docPr id="5" name="Picture 5"/>
+                  <wp:cNvGraphicFramePr>
+                    <a:graphicFrameLocks noChangeAspect="1"/>
+                  </wp:cNvGraphicFramePr>
+                  <a:graphic>
+                    <a:graphicData uri="http://schemas.openxmlformats.org/drawingml/2006/picture">
+                      <pic:pic>
+                        <pic:nvPicPr>
+                          <pic:cNvPr id="0" name="captura.png"/>
+                          <pic:cNvPicPr/>
+                        </pic:nvPicPr>
+                        <pic:blipFill>
+                          <a:blip r:embed="rId15"/>
+                          <a:stretch>
+                            <a:fillRect/>
+                          </a:stretch>
+                        </pic:blipFill>
+                        <pic:spPr>
+                          <a:xfrm>
+                            <a:off x="0" y="0"/>
+                            <a:ext cx="3060000" cy="1672326"/>
+                          </a:xfrm>
+                          <a:prstGeom prst="rect"/>
+                        </pic:spPr>
+                      </pic:pic>
+                    </a:graphicData>
+                  </a:graphic>
+                </wp:inline>
+              </w:drawing>
+            </w:r>
+          </w:p>
+          <w:p>
+            <w:r>
+              <w:rPr>
+                <w:i/>
+                <w:color w:val="555555"/>
+                <w:sz w:val="18"/>
+              </w:rPr>
+              <w:t>Fig. 5 · Gris: el robot. Azul: el punto que va a ejecutar.</w:t>
+            </w:r>
+          </w:p>
+        </w:tc>
+        <w:tc>
+          <w:tcPr>
+            <w:tcW w:type="dxa" w:w="4649"/>
+          </w:tcPr>
+          <w:p>
+            <w:pPr>
+              <w:spacing w:after="100"/>
+            </w:pPr>
+            <w:r>
+              <w:t xml:space="preserve">• </w:t>
+            </w:r>
+            <w:r>
+              <w:rPr>
+                <w:b/>
+              </w:rPr>
+              <w:t>Enseñar:</w:t>
+            </w:r>
+            <w:r>
+              <w:t xml:space="preserve"> Espacio guarda la postura del robot como punto.</w:t>
+            </w:r>
+          </w:p>
+          <w:p>
+            <w:pPr>
+              <w:spacing w:after="100"/>
+            </w:pPr>
+            <w:r>
+              <w:t xml:space="preserve">• </w:t>
+            </w:r>
+            <w:r>
+              <w:rPr>
+                <w:b/>
+              </w:rPr>
+              <w:t>Previsualizar:</w:t>
+            </w:r>
+            <w:r>
+              <w:t xml:space="preserve"> un robot «fantasma» azul recorre los puntos sin mover el real.</w:t>
+            </w:r>
+          </w:p>
+          <w:p>
+            <w:pPr>
+              <w:spacing w:after="100"/>
+            </w:pPr>
+            <w:r>
+              <w:t xml:space="preserve">• </w:t>
+            </w:r>
+            <w:r>
+              <w:rPr>
+                <w:b/>
+              </w:rPr>
+              <w:t>Ejecutar:</w:t>
+            </w:r>
+            <w:r>
+              <w:t xml:space="preserve"> envía un </w:t>
+            </w:r>
+            <w:r>
+              <w:rPr>
+                <w:rFonts w:ascii="Consolas" w:hAnsi="Consolas"/>
+              </w:rPr>
+              <w:t>movej</w:t>
+            </w:r>
+            <w:r>
+              <w:t xml:space="preserve"> por punto por el mismo socket 30001 y </w:t>
+            </w:r>
+            <w:r>
+              <w:rPr>
+                <w:b/>
+              </w:rPr>
+              <w:t>confirma</w:t>
+            </w:r>
+            <w:r>
+              <w:t xml:space="preserve"> cada uno.</w:t>
+            </w:r>
+          </w:p>
+        </w:tc>
+      </w:tr>
+    </w:tbl>
+    <w:p>
+      <w:pPr>
+        <w:spacing w:after="0"/>
+      </w:pPr>
+    </w:p>
+    <w:p>
+      <w:pPr>
+        <w:keepNext/>
+        <w:spacing w:before="80" w:after="40"/>
+        <w:jc w:val="center"/>
+      </w:pPr>
+      <w:r>
+        <w:drawing>
+          <wp:inline xmlns:a="http://schemas.openxmlformats.org/drawingml/2006/main" xmlns:pic="http://schemas.openxmlformats.org/drawingml/2006/picture">
+            <wp:extent cx="3600000" cy="1677272"/>
+            <wp:docPr id="6" name="Picture 6"/>
+            <wp:cNvGraphicFramePr>
+              <a:graphicFrameLocks noChangeAspect="1"/>
+            </wp:cNvGraphicFramePr>
+            <a:graphic>
+              <a:graphicData uri="http://schemas.openxmlformats.org/drawingml/2006/picture">
+                <pic:pic>
+                  <pic:nvPicPr>
+                    <pic:cNvPr id="0" name="estados.png"/>
+                    <pic:cNvPicPr/>
+                  </pic:nvPicPr>
+                  <pic:blipFill>
+                    <a:blip r:embed="rId16"/>
+                    <a:stretch>
+                      <a:fillRect/>
+                    </a:stretch>
+                  </pic:blipFill>
+                  <pic:spPr>
+                    <a:xfrm>
+                      <a:off x="0" y="0"/>
+                      <a:ext cx="3600000" cy="1677272"/>
+                    </a:xfrm>
+                    <a:prstGeom prst="rect"/>
+                  </pic:spPr>
+                </pic:pic>
+              </a:graphicData>
+            </a:graphic>
+          </wp:inline>
+        </w:drawing>
+      </w:r>
+    </w:p>
+    <w:p>
+      <w:pPr>
+        <w:spacing w:after="160"/>
+        <w:jc w:val="center"/>
+      </w:pPr>
+      <w:r>
+        <w:rPr>
+          <w:i/>
+          <w:color w:val="555555"/>
+          <w:sz w:val="19"/>
+        </w:rPr>
+        <w:t>Fig. 6 · Máquina de estados. Ante un error o parada se detiene y muestra el motivo.</w:t>
+      </w:r>
+    </w:p>
+    <w:p>
+      <w:pPr>
+        <w:keepNext/>
+        <w:spacing w:before="80" w:after="40"/>
+        <w:jc w:val="center"/>
+      </w:pPr>
+      <w:r>
+        <w:drawing>
+          <wp:inline xmlns:a="http://schemas.openxmlformats.org/drawingml/2006/main" xmlns:pic="http://schemas.openxmlformats.org/drawingml/2006/picture">
+            <wp:extent cx="4860000" cy="1965690"/>
+            <wp:docPr id="7" name="Picture 7"/>
+            <wp:cNvGraphicFramePr>
+              <a:graphicFrameLocks noChangeAspect="1"/>
+            </wp:cNvGraphicFramePr>
+            <a:graphic>
+              <a:graphicData uri="http://schemas.openxmlformats.org/drawingml/2006/picture">
+                <pic:pic>
+                  <pic:nvPicPr>
+                    <pic:cNvPr id="0" name="movej.png"/>
+                    <pic:cNvPicPr/>
+                  </pic:nvPicPr>
+                  <pic:blipFill>
+                    <a:blip r:embed="rId17"/>
+                    <a:stretch>
+                      <a:fillRect/>
+                    </a:stretch>
+                  </pic:blipFill>
+                  <pic:spPr>
+                    <a:xfrm>
+                      <a:off x="0" y="0"/>
+                      <a:ext cx="4860000" cy="1965690"/>
+                    </a:xfrm>
+                    <a:prstGeom prst="rect"/>
+                  </pic:spPr>
+                </pic:pic>
+              </a:graphicData>
+            </a:graphic>
+          </wp:inline>
+        </w:drawing>
+      </w:r>
+    </w:p>
+    <w:p>
+      <w:pPr>
+        <w:spacing w:after="160"/>
+        <w:jc w:val="center"/>
+      </w:pPr>
+      <w:r>
+        <w:rPr>
+          <w:i/>
+          <w:color w:val="555555"/>
+          <w:sz w:val="19"/>
+        </w:rPr>
+        <w:t>Fig. 7 · Datos reales de URSim. El robot no responde a un movej: el punto se da por bueno cuando el programa termina y el ángulo está a menos de 0,01 rad.</w:t>
+      </w:r>
+    </w:p>
+    <w:p>
+      <w:pPr>
+        <w:keepNext/>
+        <w:spacing w:before="200" w:after="60"/>
+      </w:pPr>
+      <w:r>
+        <w:rPr>
+          <w:b/>
+          <w:color w:val="005EB8"/>
+          <w:sz w:val="28"/>
+        </w:rPr>
+        <w:t>Además</w:t>
       </w:r>
     </w:p>
     <w:p>
@@ -886,30 +856,6 @@
     </w:p>
     <w:p>
       <w:pPr>
-        <w:pStyle w:val="ListBullet"/>
-        <w:spacing w:after="40"/>
-      </w:pPr>
-      <w:r>
-        <w:rPr>
-          <w:b/>
-        </w:rPr>
-        <w:t>Fácil de usar:</w:t>
-      </w:r>
-      <w:r>
-        <w:t xml:space="preserve"> F5 en VS Code, ajustes como constantes al principio, IP en </w:t>
-      </w:r>
-      <w:r>
-        <w:rPr>
-          <w:rFonts w:ascii="Consolas" w:hAnsi="Consolas"/>
-        </w:rPr>
-        <w:t>robots.json</w:t>
-      </w:r>
-      <w:r>
-        <w:t>.</w:t>
-      </w:r>
-    </w:p>
-    <w:p>
-      <w:pPr>
         <w:keepNext/>
         <w:spacing w:before="200" w:after="60"/>
       </w:pPr>
@@ -919,7 +865,7 @@
           <w:color w:val="005EB8"/>
           <w:sz w:val="28"/>
         </w:rPr>
-        <w:t>7. Robot real</w:t>
+        <w:t>Robot real</w:t>
       </w:r>
     </w:p>
     <w:p>

</xml_diff>